<commit_message>
Update document processing configuration and formatting utility
- Updated .gitignore to expand Microsoft Office file exclusions and add comprehensive temporary/build artifact patterns
- Modified LEG-SGI-01_Registro_Requisiti_Legali_Tresun_DEFINITIVO_FORMATTATO.docx with structured document content including metadata and XML components
- Enhanced copy_formatting.py with improved element handling for paragraphs and tables, adding style preservation and error handling for document formatting transfer
</commit_message>
<xml_diff>
--- a/LEG-SGI-01_Registro_Requisiti_Legali_Tresun_DEFINITIVO_FORMATTATO.docx
+++ b/LEG-SGI-01_Registro_Requisiti_Legali_Tresun_DEFINITIVO_FORMATTATO.docx
@@ -21275,6 +21275,3686 @@
         </w:rPr>
         <w:t xml:space="preserve">Tabella 16 - Documenti Correlati del Sistema di Gestione Integrato</w:t>
       </w:r>
+    </w:p>
+    <w:tbl>
+      <w:tblPr>
+        <w:tblStyle w:val="Tabellanormale"/>
+        <w:tblW w:type="auto" w:w="0"/>
+        <w:tblLook w:firstColumn="1" w:firstRow="1" w:lastColumn="0" w:lastRow="0" w:noHBand="0" w:noVBand="1" w:val="04A0"/>
+      </w:tblPr>
+      <w:tblGrid>
+        <w:gridCol w:w="3118"/>
+        <w:gridCol w:w="3118"/>
+        <w:gridCol w:w="3118"/>
+      </w:tblGrid>
+      <w:tr>
+        <w:tc>
+          <w:tcPr>
+            <w:tcW w:type="dxa" w:w="3118"/>
+          </w:tcPr>
+          <w:p>
+            <w:r/>
+          </w:p>
+        </w:tc>
+        <w:tc>
+          <w:tcPr>
+            <w:tcW w:type="dxa" w:w="3118"/>
+          </w:tcPr>
+          <w:p>
+            <w:r/>
+          </w:p>
+        </w:tc>
+        <w:tc>
+          <w:tcPr>
+            <w:tcW w:type="dxa" w:w="3118"/>
+          </w:tcPr>
+          <w:p>
+            <w:r/>
+          </w:p>
+        </w:tc>
+      </w:tr>
+    </w:tbl>
+    <w:p>
+      <w:r/>
+    </w:p>
+    <w:p>
+      <w:r>
+        <w:t>TRESUN S.r.l.</w:t>
+      </w:r>
+    </w:p>
+    <w:p>
+      <w:r>
+        <w:t>MANUALE DEL</w:t>
+      </w:r>
+    </w:p>
+    <w:p>
+      <w:r>
+        <w:t>SISTEMA DI GESTIONE INTEGRATO</w:t>
+      </w:r>
+    </w:p>
+    <w:p>
+      <w:r>
+        <w:t>(SGI)</w:t>
+      </w:r>
+    </w:p>
+    <w:tbl>
+      <w:tblPr>
+        <w:tblStyle w:val="Tabellanormale"/>
+        <w:tblW w:type="auto" w:w="0"/>
+        <w:tblLook w:firstColumn="1" w:firstRow="1" w:lastColumn="0" w:lastRow="0" w:noHBand="0" w:noVBand="1" w:val="04A0"/>
+      </w:tblPr>
+      <w:tblGrid>
+        <w:gridCol w:w="3118"/>
+        <w:gridCol w:w="3118"/>
+        <w:gridCol w:w="3118"/>
+      </w:tblGrid>
+      <w:tr>
+        <w:tc>
+          <w:tcPr>
+            <w:tcW w:type="dxa" w:w="3118"/>
+          </w:tcPr>
+          <w:p>
+            <w:r>
+              <w:t>ISO 9001</w:t>
+            </w:r>
+          </w:p>
+        </w:tc>
+        <w:tc>
+          <w:tcPr>
+            <w:tcW w:type="dxa" w:w="3118"/>
+          </w:tcPr>
+          <w:p>
+            <w:r>
+              <w:t>ISO 14001</w:t>
+            </w:r>
+          </w:p>
+        </w:tc>
+        <w:tc>
+          <w:tcPr>
+            <w:tcW w:type="dxa" w:w="3118"/>
+          </w:tcPr>
+          <w:p>
+            <w:r>
+              <w:t>ISO 45001</w:t>
+            </w:r>
+          </w:p>
+        </w:tc>
+      </w:tr>
+      <w:tr>
+        <w:tc>
+          <w:tcPr>
+            <w:tcW w:type="dxa" w:w="3118"/>
+          </w:tcPr>
+          <w:p>
+            <w:r>
+              <w:t>Qualità</w:t>
+            </w:r>
+          </w:p>
+        </w:tc>
+        <w:tc>
+          <w:tcPr>
+            <w:tcW w:type="dxa" w:w="3118"/>
+          </w:tcPr>
+          <w:p>
+            <w:r>
+              <w:t>Ambiente</w:t>
+            </w:r>
+          </w:p>
+        </w:tc>
+        <w:tc>
+          <w:tcPr>
+            <w:tcW w:type="dxa" w:w="3118"/>
+          </w:tcPr>
+          <w:p>
+            <w:r>
+              <w:t>Sicurezza</w:t>
+            </w:r>
+          </w:p>
+        </w:tc>
+      </w:tr>
+    </w:tbl>
+    <w:p>
+      <w:r/>
+    </w:p>
+    <w:tbl>
+      <w:tblPr>
+        <w:tblStyle w:val="Tabellanormale"/>
+        <w:tblW w:type="auto" w:w="0"/>
+        <w:tblLook w:firstColumn="1" w:firstRow="1" w:lastColumn="0" w:lastRow="0" w:noHBand="0" w:noVBand="1" w:val="04A0"/>
+      </w:tblPr>
+      <w:tblGrid>
+        <w:gridCol w:w="9354"/>
+      </w:tblGrid>
+      <w:tr>
+        <w:tc>
+          <w:tcPr>
+            <w:tcW w:type="dxa" w:w="9354"/>
+          </w:tcPr>
+          <w:p>
+            <w:r>
+              <w:t>Codice ATECO: 43.21.01</w:t>
+              <w:br/>
+              <w:t>Installazione di impianti elettrici</w:t>
+              <w:br/>
+              <w:t>Settore: Energie Rinnovabili - Impianti Fotovoltaici</w:t>
+            </w:r>
+          </w:p>
+        </w:tc>
+      </w:tr>
+    </w:tbl>
+    <w:p>
+      <w:r/>
+    </w:p>
+    <w:p>
+      <w:r/>
+    </w:p>
+    <w:p>
+      <w:r/>
+    </w:p>
+    <w:p>
+      <w:r/>
+    </w:p>
+    <w:p>
+      <w:r/>
+    </w:p>
+    <w:p>
+      <w:r/>
+    </w:p>
+    <w:p>
+      <w:r/>
+    </w:p>
+    <w:p>
+      <w:r/>
+    </w:p>
+    <w:p>
+      <w:r>
+        <w:tab/>
+      </w:r>
+    </w:p>
+    <w:p>
+      <w:r>
+        <w:tab/>
+      </w:r>
+    </w:p>
+    <w:p>
+      <w:r/>
+    </w:p>
+    <w:p>
+      <w:r/>
+    </w:p>
+    <w:p>
+      <w:r/>
+    </w:p>
+    <w:p>
+      <w:r>
+        <w:tab/>
+      </w:r>
+    </w:p>
+    <w:p>
+      <w:r>
+        <w:tab/>
+      </w:r>
+    </w:p>
+    <w:tbl>
+      <w:tblPr>
+        <w:tblStyle w:val="Tabellanormale"/>
+        <w:tblW w:type="auto" w:w="0"/>
+        <w:tblLook w:firstColumn="1" w:firstRow="1" w:lastColumn="0" w:lastRow="0" w:noHBand="0" w:noVBand="1" w:val="04A0"/>
+      </w:tblPr>
+      <w:tblGrid>
+        <w:gridCol w:w="3118"/>
+        <w:gridCol w:w="3118"/>
+        <w:gridCol w:w="3118"/>
+      </w:tblGrid>
+      <w:tr>
+        <w:tc>
+          <w:tcPr>
+            <w:tcW w:type="dxa" w:w="3118"/>
+          </w:tcPr>
+          <w:p>
+            <w:r>
+              <w:t>CODICE DOCUMENTO</w:t>
+            </w:r>
+          </w:p>
+        </w:tc>
+        <w:tc>
+          <w:tcPr>
+            <w:tcW w:type="dxa" w:w="3118"/>
+          </w:tcPr>
+          <w:p>
+            <w:r>
+              <w:t>REVISIONE</w:t>
+            </w:r>
+          </w:p>
+        </w:tc>
+        <w:tc>
+          <w:tcPr>
+            <w:tcW w:type="dxa" w:w="3118"/>
+          </w:tcPr>
+          <w:p>
+            <w:r>
+              <w:t>DATA EMISSIONE</w:t>
+            </w:r>
+          </w:p>
+        </w:tc>
+      </w:tr>
+      <w:tr>
+        <w:tc>
+          <w:tcPr>
+            <w:tcW w:type="dxa" w:w="3118"/>
+          </w:tcPr>
+          <w:p>
+            <w:r>
+              <w:t>M-SGI-01</w:t>
+            </w:r>
+          </w:p>
+        </w:tc>
+        <w:tc>
+          <w:tcPr>
+            <w:tcW w:type="dxa" w:w="3118"/>
+          </w:tcPr>
+          <w:p>
+            <w:r>
+              <w:t>00</w:t>
+            </w:r>
+          </w:p>
+        </w:tc>
+        <w:tc>
+          <w:tcPr>
+            <w:tcW w:type="dxa" w:w="3118"/>
+          </w:tcPr>
+          <w:p>
+            <w:r>
+              <w:t>20/03/2026</w:t>
+            </w:r>
+          </w:p>
+        </w:tc>
+      </w:tr>
+    </w:tbl>
+    <w:p>
+      <w:r/>
+    </w:p>
+    <w:p>
+      <w:r>
+        <w:t>MATRICE DI APPROVAZIONE</w:t>
+      </w:r>
+    </w:p>
+    <w:p>
+      <w:r/>
+    </w:p>
+    <w:tbl>
+      <w:tblPr>
+        <w:tblStyle w:val="Tabellanormale"/>
+        <w:tblW w:type="auto" w:w="0"/>
+        <w:tblLook w:firstColumn="1" w:firstRow="1" w:lastColumn="0" w:lastRow="0" w:noHBand="0" w:noVBand="1" w:val="04A0"/>
+      </w:tblPr>
+      <w:tblGrid>
+        <w:gridCol w:w="2338"/>
+        <w:gridCol w:w="2338"/>
+        <w:gridCol w:w="2338"/>
+        <w:gridCol w:w="2338"/>
+      </w:tblGrid>
+      <w:tr>
+        <w:tc>
+          <w:tcPr>
+            <w:tcW w:type="dxa" w:w="2338"/>
+          </w:tcPr>
+          <w:p>
+            <w:r>
+              <w:t>RUOLO</w:t>
+            </w:r>
+          </w:p>
+        </w:tc>
+        <w:tc>
+          <w:tcPr>
+            <w:tcW w:type="dxa" w:w="2338"/>
+          </w:tcPr>
+          <w:p>
+            <w:r>
+              <w:t>NOME E COGNOME</w:t>
+            </w:r>
+          </w:p>
+        </w:tc>
+        <w:tc>
+          <w:tcPr>
+            <w:tcW w:type="dxa" w:w="2338"/>
+          </w:tcPr>
+          <w:p>
+            <w:r>
+              <w:t>FIRMA</w:t>
+            </w:r>
+          </w:p>
+        </w:tc>
+        <w:tc>
+          <w:tcPr>
+            <w:tcW w:type="dxa" w:w="2338"/>
+          </w:tcPr>
+          <w:p>
+            <w:r>
+              <w:t>DATA</w:t>
+            </w:r>
+          </w:p>
+        </w:tc>
+      </w:tr>
+      <w:tr>
+        <w:tc>
+          <w:tcPr>
+            <w:tcW w:type="dxa" w:w="2338"/>
+          </w:tcPr>
+          <w:p>
+            <w:r>
+              <w:t>Redazione</w:t>
+            </w:r>
+          </w:p>
+        </w:tc>
+        <w:tc>
+          <w:tcPr>
+            <w:tcW w:type="dxa" w:w="2338"/>
+          </w:tcPr>
+          <w:p>
+            <w:r>
+              <w:t>Responsabile SGI</w:t>
+            </w:r>
+          </w:p>
+        </w:tc>
+        <w:tc>
+          <w:tcPr>
+            <w:tcW w:type="dxa" w:w="2338"/>
+          </w:tcPr>
+          <w:p>
+            <w:r/>
+          </w:p>
+        </w:tc>
+        <w:tc>
+          <w:tcPr>
+            <w:tcW w:type="dxa" w:w="2338"/>
+          </w:tcPr>
+          <w:p>
+            <w:r/>
+          </w:p>
+        </w:tc>
+      </w:tr>
+      <w:tr>
+        <w:tc>
+          <w:tcPr>
+            <w:tcW w:type="dxa" w:w="2338"/>
+          </w:tcPr>
+          <w:p>
+            <w:r>
+              <w:t>Verifica</w:t>
+            </w:r>
+          </w:p>
+        </w:tc>
+        <w:tc>
+          <w:tcPr>
+            <w:tcW w:type="dxa" w:w="2338"/>
+          </w:tcPr>
+          <w:p>
+            <w:r>
+              <w:t>Direzione Tecnica</w:t>
+            </w:r>
+          </w:p>
+        </w:tc>
+        <w:tc>
+          <w:tcPr>
+            <w:tcW w:type="dxa" w:w="2338"/>
+          </w:tcPr>
+          <w:p>
+            <w:r/>
+          </w:p>
+        </w:tc>
+        <w:tc>
+          <w:tcPr>
+            <w:tcW w:type="dxa" w:w="2338"/>
+          </w:tcPr>
+          <w:p>
+            <w:r/>
+          </w:p>
+        </w:tc>
+      </w:tr>
+      <w:tr>
+        <w:tc>
+          <w:tcPr>
+            <w:tcW w:type="dxa" w:w="2338"/>
+          </w:tcPr>
+          <w:p>
+            <w:r>
+              <w:t>Approvazione</w:t>
+            </w:r>
+          </w:p>
+        </w:tc>
+        <w:tc>
+          <w:tcPr>
+            <w:tcW w:type="dxa" w:w="2338"/>
+          </w:tcPr>
+          <w:p>
+            <w:r>
+              <w:t>Direzione Generale</w:t>
+            </w:r>
+          </w:p>
+        </w:tc>
+        <w:tc>
+          <w:tcPr>
+            <w:tcW w:type="dxa" w:w="2338"/>
+          </w:tcPr>
+          <w:p>
+            <w:r/>
+          </w:p>
+        </w:tc>
+        <w:tc>
+          <w:tcPr>
+            <w:tcW w:type="dxa" w:w="2338"/>
+          </w:tcPr>
+          <w:p>
+            <w:r/>
+          </w:p>
+        </w:tc>
+      </w:tr>
+    </w:tbl>
+    <w:p>
+      <w:r/>
+    </w:p>
+    <w:p>
+      <w:r>
+        <w:t>STORICO REVISIONI</w:t>
+      </w:r>
+    </w:p>
+    <w:p>
+      <w:r/>
+    </w:p>
+    <w:tbl>
+      <w:tblPr>
+        <w:tblStyle w:val="Tabellanormale"/>
+        <w:tblW w:type="auto" w:w="0"/>
+        <w:tblLook w:firstColumn="1" w:firstRow="1" w:lastColumn="0" w:lastRow="0" w:noHBand="0" w:noVBand="1" w:val="04A0"/>
+      </w:tblPr>
+      <w:tblGrid>
+        <w:gridCol w:w="2338"/>
+        <w:gridCol w:w="2338"/>
+        <w:gridCol w:w="2338"/>
+        <w:gridCol w:w="2338"/>
+      </w:tblGrid>
+      <w:tr>
+        <w:tc>
+          <w:tcPr>
+            <w:tcW w:type="dxa" w:w="2338"/>
+          </w:tcPr>
+          <w:p>
+            <w:r>
+              <w:t>REV.</w:t>
+            </w:r>
+          </w:p>
+        </w:tc>
+        <w:tc>
+          <w:tcPr>
+            <w:tcW w:type="dxa" w:w="2338"/>
+          </w:tcPr>
+          <w:p>
+            <w:r>
+              <w:t>DATA</w:t>
+            </w:r>
+          </w:p>
+        </w:tc>
+        <w:tc>
+          <w:tcPr>
+            <w:tcW w:type="dxa" w:w="2338"/>
+          </w:tcPr>
+          <w:p>
+            <w:r>
+              <w:t>REDATTO DA</w:t>
+            </w:r>
+          </w:p>
+        </w:tc>
+        <w:tc>
+          <w:tcPr>
+            <w:tcW w:type="dxa" w:w="2338"/>
+          </w:tcPr>
+          <w:p>
+            <w:r>
+              <w:t>DESCRIZIONE MODIFICA</w:t>
+            </w:r>
+          </w:p>
+        </w:tc>
+      </w:tr>
+      <w:tr>
+        <w:tc>
+          <w:tcPr>
+            <w:tcW w:type="dxa" w:w="2338"/>
+          </w:tcPr>
+          <w:p>
+            <w:r>
+              <w:t>00</w:t>
+            </w:r>
+          </w:p>
+        </w:tc>
+        <w:tc>
+          <w:tcPr>
+            <w:tcW w:type="dxa" w:w="2338"/>
+          </w:tcPr>
+          <w:p>
+            <w:r>
+              <w:t>20/03/2026</w:t>
+            </w:r>
+          </w:p>
+        </w:tc>
+        <w:tc>
+          <w:tcPr>
+            <w:tcW w:type="dxa" w:w="2338"/>
+          </w:tcPr>
+          <w:p>
+            <w:r>
+              <w:t>Resp. SGI</w:t>
+            </w:r>
+          </w:p>
+        </w:tc>
+        <w:tc>
+          <w:tcPr>
+            <w:tcW w:type="dxa" w:w="2338"/>
+          </w:tcPr>
+          <w:p>
+            <w:r>
+              <w:t>Prima Emissione per Audit — Sistema di Gestione Integrato ISO 9001/14001/45001</w:t>
+            </w:r>
+          </w:p>
+        </w:tc>
+      </w:tr>
+      <w:tr>
+        <w:tc>
+          <w:tcPr>
+            <w:tcW w:type="dxa" w:w="2338"/>
+          </w:tcPr>
+          <w:p>
+            <w:r/>
+          </w:p>
+        </w:tc>
+        <w:tc>
+          <w:tcPr>
+            <w:tcW w:type="dxa" w:w="2338"/>
+          </w:tcPr>
+          <w:p>
+            <w:r/>
+          </w:p>
+        </w:tc>
+        <w:tc>
+          <w:tcPr>
+            <w:tcW w:type="dxa" w:w="2338"/>
+          </w:tcPr>
+          <w:p>
+            <w:r/>
+          </w:p>
+        </w:tc>
+        <w:tc>
+          <w:tcPr>
+            <w:tcW w:type="dxa" w:w="2338"/>
+          </w:tcPr>
+          <w:p>
+            <w:r/>
+          </w:p>
+        </w:tc>
+      </w:tr>
+    </w:tbl>
+    <w:p>
+      <w:r/>
+    </w:p>
+    <w:p>
+      <w:r>
+        <w:t>INDICE DEI CONTENUTI</w:t>
+      </w:r>
+    </w:p>
+    <w:p>
+      <w:r>
+        <w:t>1. Scopo e campo di applicazione</w:t>
+      </w:r>
+    </w:p>
+    <w:p>
+      <w:r>
+        <w:t>Il presente Manuale descrive il Sistema di Gestione Integrato (SGI) adottato da Tresun S.r.l. in conformità alle norme ISO 9001:2015, ISO 14001:2015 e ISO 45001:2018. Il Sistema di Gestione Integrato rappresenta l'approccio strutturato e sistematico con cui l'organizzazione gestisce i processi di qualità, ambientali e di salute e sicurezza sul lavoro, garantendo il miglioramento continuo delle prestazioni complessive.</w:t>
+      </w:r>
+    </w:p>
+    <w:p>
+      <w:r>
+        <w:t>Il SGI si applica a tutte le attività svolte dall'azienda, con particolare riferimento alle seguenti aree operative:</w:t>
+      </w:r>
+    </w:p>
+    <w:p>
+      <w:r>
+        <w:t>Costruzione di impianti fotovoltaici</w:t>
+      </w:r>
+    </w:p>
+    <w:p>
+      <w:r>
+        <w:t>Revamping e sostituzione componenti</w:t>
+      </w:r>
+    </w:p>
+    <w:p>
+      <w:r>
+        <w:t>Manutenzione ordinaria e straordinaria</w:t>
+      </w:r>
+    </w:p>
+    <w:p>
+      <w:r>
+        <w:t>Monitoraggio e diagnostica degli impianti</w:t>
+      </w:r>
+    </w:p>
+    <w:p>
+      <w:r>
+        <w:t>Il sistema copre tutte le sedi operative, i cantieri temporanei e mobili e le attività svolte presso i clienti, assicurando un approccio uniforme e coordinato alla gestione integrata dei processi aziendali.</w:t>
+      </w:r>
+    </w:p>
+    <w:p>
+      <w:r>
+        <w:t>2. Profilo aziendale</w:t>
+      </w:r>
+    </w:p>
+    <w:p>
+      <w:r>
+        <w:t>Tresun S.r.l. opera nel settore delle energie rinnovabili, con competenze specifiche nella realizzazione e gestione di impianti fotovoltaici. L'azienda ha sviluppato nel tempo una solida esperienza nel campo dell'installazione, manutenzione e ottimizzazione di sistemi fotovoltaici, distinguendosi per l'elevata qualità dei servizi offerti e l'attenzione costante alla sicurezza e alla sostenibilità ambientale.</w:t>
+      </w:r>
+    </w:p>
+    <w:p>
+      <w:r>
+        <w:t>Punti di forza aziendali</w:t>
+      </w:r>
+    </w:p>
+    <w:tbl>
+      <w:tblPr>
+        <w:tblStyle w:val="Tabellanormale"/>
+        <w:tblW w:type="auto" w:w="0"/>
+        <w:tblLook w:firstColumn="1" w:firstRow="1" w:lastColumn="0" w:lastRow="0" w:noHBand="0" w:noVBand="1" w:val="04A0"/>
+      </w:tblPr>
+      <w:tblGrid>
+        <w:gridCol w:w="4677"/>
+        <w:gridCol w:w="4677"/>
+      </w:tblGrid>
+      <w:tr>
+        <w:tc>
+          <w:tcPr>
+            <w:tcW w:type="dxa" w:w="4677"/>
+          </w:tcPr>
+          <w:p>
+            <w:r>
+              <w:t>Area</w:t>
+            </w:r>
+          </w:p>
+        </w:tc>
+        <w:tc>
+          <w:tcPr>
+            <w:tcW w:type="dxa" w:w="4677"/>
+          </w:tcPr>
+          <w:p>
+            <w:r>
+              <w:t>Descrizione</w:t>
+            </w:r>
+          </w:p>
+        </w:tc>
+      </w:tr>
+      <w:tr>
+        <w:tc>
+          <w:tcPr>
+            <w:tcW w:type="dxa" w:w="4677"/>
+          </w:tcPr>
+          <w:p>
+            <w:r>
+              <w:t>Specializzazione tecnica</w:t>
+            </w:r>
+          </w:p>
+        </w:tc>
+        <w:tc>
+          <w:tcPr>
+            <w:tcW w:type="dxa" w:w="4677"/>
+          </w:tcPr>
+          <w:p>
+            <w:r>
+              <w:t>Elevata competenza nella progettazione e installazione di impianti fotovoltaici</w:t>
+            </w:r>
+          </w:p>
+        </w:tc>
+      </w:tr>
+      <w:tr>
+        <w:tc>
+          <w:tcPr>
+            <w:tcW w:type="dxa" w:w="4677"/>
+          </w:tcPr>
+          <w:p>
+            <w:r>
+              <w:t>Sicurezza nei cantieri</w:t>
+            </w:r>
+          </w:p>
+        </w:tc>
+        <w:tc>
+          <w:tcPr>
+            <w:tcW w:type="dxa" w:w="4677"/>
+          </w:tcPr>
+          <w:p>
+            <w:r>
+              <w:t>Attenzione prioritaria alla tutela della salute e sicurezza dei lavoratori</w:t>
+            </w:r>
+          </w:p>
+        </w:tc>
+      </w:tr>
+      <w:tr>
+        <w:tc>
+          <w:tcPr>
+            <w:tcW w:type="dxa" w:w="4677"/>
+          </w:tcPr>
+          <w:p>
+            <w:r>
+              <w:t>Gestione ambientale</w:t>
+            </w:r>
+          </w:p>
+        </w:tc>
+        <w:tc>
+          <w:tcPr>
+            <w:tcW w:type="dxa" w:w="4677"/>
+          </w:tcPr>
+          <w:p>
+            <w:r>
+              <w:t>Approccio responsabile nella gestione degli aspetti ambientali e dei rifiuti</w:t>
+            </w:r>
+          </w:p>
+        </w:tc>
+      </w:tr>
+      <w:tr>
+        <w:tc>
+          <w:tcPr>
+            <w:tcW w:type="dxa" w:w="4677"/>
+          </w:tcPr>
+          <w:p>
+            <w:r>
+              <w:t>Qualità del servizio</w:t>
+            </w:r>
+          </w:p>
+        </w:tc>
+        <w:tc>
+          <w:tcPr>
+            <w:tcW w:type="dxa" w:w="4677"/>
+          </w:tcPr>
+          <w:p>
+            <w:r>
+              <w:t>Impegno al rispetto delle tempistiche e alla soddisfazione del cliente</w:t>
+            </w:r>
+          </w:p>
+        </w:tc>
+      </w:tr>
+    </w:tbl>
+    <w:p>
+      <w:r/>
+    </w:p>
+    <w:p>
+      <w:r>
+        <w:t>3. Riferimenti normativi</w:t>
+      </w:r>
+    </w:p>
+    <w:p>
+      <w:r>
+        <w:t>Il Sistema di Gestione Integrato è sviluppato in conformità ai seguenti riferimenti normativi, che costituiscono il quadro di riferimento per tutte le attività aziendali:</w:t>
+      </w:r>
+    </w:p>
+    <w:tbl>
+      <w:tblPr>
+        <w:tblStyle w:val="Tabellanormale"/>
+        <w:tblW w:type="auto" w:w="0"/>
+        <w:tblLook w:firstColumn="1" w:firstRow="1" w:lastColumn="0" w:lastRow="0" w:noHBand="0" w:noVBand="1" w:val="04A0"/>
+      </w:tblPr>
+      <w:tblGrid>
+        <w:gridCol w:w="4677"/>
+        <w:gridCol w:w="4677"/>
+      </w:tblGrid>
+      <w:tr>
+        <w:tc>
+          <w:tcPr>
+            <w:tcW w:type="dxa" w:w="4677"/>
+          </w:tcPr>
+          <w:p>
+            <w:r>
+              <w:t>Riferimento</w:t>
+            </w:r>
+          </w:p>
+        </w:tc>
+        <w:tc>
+          <w:tcPr>
+            <w:tcW w:type="dxa" w:w="4677"/>
+          </w:tcPr>
+          <w:p>
+            <w:r>
+              <w:t>Descrizione</w:t>
+            </w:r>
+          </w:p>
+        </w:tc>
+      </w:tr>
+      <w:tr>
+        <w:tc>
+          <w:tcPr>
+            <w:tcW w:type="dxa" w:w="4677"/>
+          </w:tcPr>
+          <w:p>
+            <w:r>
+              <w:t>ISO 9001:2015</w:t>
+            </w:r>
+          </w:p>
+        </w:tc>
+        <w:tc>
+          <w:tcPr>
+            <w:tcW w:type="dxa" w:w="4677"/>
+          </w:tcPr>
+          <w:p>
+            <w:r>
+              <w:t>Sistemi di gestione per la qualità</w:t>
+            </w:r>
+          </w:p>
+        </w:tc>
+      </w:tr>
+      <w:tr>
+        <w:tc>
+          <w:tcPr>
+            <w:tcW w:type="dxa" w:w="4677"/>
+          </w:tcPr>
+          <w:p>
+            <w:r>
+              <w:t>ISO 14001:2015</w:t>
+            </w:r>
+          </w:p>
+        </w:tc>
+        <w:tc>
+          <w:tcPr>
+            <w:tcW w:type="dxa" w:w="4677"/>
+          </w:tcPr>
+          <w:p>
+            <w:r>
+              <w:t>Sistemi di gestione ambientale</w:t>
+            </w:r>
+          </w:p>
+        </w:tc>
+      </w:tr>
+      <w:tr>
+        <w:tc>
+          <w:tcPr>
+            <w:tcW w:type="dxa" w:w="4677"/>
+          </w:tcPr>
+          <w:p>
+            <w:r>
+              <w:t>ISO 45001:2018</w:t>
+            </w:r>
+          </w:p>
+        </w:tc>
+        <w:tc>
+          <w:tcPr>
+            <w:tcW w:type="dxa" w:w="4677"/>
+          </w:tcPr>
+          <w:p>
+            <w:r>
+              <w:t>Sistemi di gestione per la salute e sicurezza sul lavoro</w:t>
+            </w:r>
+          </w:p>
+        </w:tc>
+      </w:tr>
+      <w:tr>
+        <w:tc>
+          <w:tcPr>
+            <w:tcW w:type="dxa" w:w="4677"/>
+          </w:tcPr>
+          <w:p>
+            <w:r>
+              <w:t>D.Lgs. 81/08</w:t>
+            </w:r>
+          </w:p>
+        </w:tc>
+        <w:tc>
+          <w:tcPr>
+            <w:tcW w:type="dxa" w:w="4677"/>
+          </w:tcPr>
+          <w:p>
+            <w:r>
+              <w:t>Testo Unico sulla Salute e Sicurezza sul Lavoro e successive modifiche</w:t>
+            </w:r>
+          </w:p>
+        </w:tc>
+      </w:tr>
+      <w:tr>
+        <w:tc>
+          <w:tcPr>
+            <w:tcW w:type="dxa" w:w="4677"/>
+          </w:tcPr>
+          <w:p>
+            <w:r>
+              <w:t>Normativa ambientale</w:t>
+            </w:r>
+          </w:p>
+        </w:tc>
+        <w:tc>
+          <w:tcPr>
+            <w:tcW w:type="dxa" w:w="4677"/>
+          </w:tcPr>
+          <w:p>
+            <w:r>
+              <w:t>RAEE, gestione rifiuti, emissioni, autorizzazioni ambientali</w:t>
+            </w:r>
+          </w:p>
+        </w:tc>
+      </w:tr>
+      <w:tr>
+        <w:tc>
+          <w:tcPr>
+            <w:tcW w:type="dxa" w:w="4677"/>
+          </w:tcPr>
+          <w:p>
+            <w:r>
+              <w:t>Normativa tecnica</w:t>
+            </w:r>
+          </w:p>
+        </w:tc>
+        <w:tc>
+          <w:tcPr>
+            <w:tcW w:type="dxa" w:w="4677"/>
+          </w:tcPr>
+          <w:p>
+            <w:r>
+              <w:t>Norme CEI, requisiti GSE, specifiche distributori di rete</w:t>
+            </w:r>
+          </w:p>
+        </w:tc>
+      </w:tr>
+    </w:tbl>
+    <w:p>
+      <w:r/>
+    </w:p>
+    <w:p>
+      <w:r>
+        <w:t>4. Contesto dell'organizzazione</w:t>
+      </w:r>
+    </w:p>
+    <w:p>
+      <w:r>
+        <w:t>L'analisi del contesto organizzativo costituisce un elemento fondamentale per la pianificazione e il funzionamento efficace del Sistema di Gestione Integrato. Tresun S.r.l. monitora costantemente i fattori interni ed esterni che possono influenzare le proprie attività e le aspettative delle parti interessate.</w:t>
+      </w:r>
+    </w:p>
+    <w:p>
+      <w:r>
+        <w:t>4.1 Fattori interni</w:t>
+      </w:r>
+    </w:p>
+    <w:p>
+      <w:r>
+        <w:t>I principali fattori interni che caratterizzano il contesto organizzativo comprendono:</w:t>
+      </w:r>
+    </w:p>
+    <w:p>
+      <w:r>
+        <w:t>Competenze tecniche del personale: elevata specializzazione nella progettazione e installazione di impianti fotovoltaici, con aggiornamento continuo sulle nuove tecnologie</w:t>
+      </w:r>
+    </w:p>
+    <w:p>
+      <w:r>
+        <w:t>Attrezzature e DPI specifici per lavori elettrici e in quota: dotazione completa di strumenti di misura, attrezzature di sollevamento e dispositivi di protezione individuale certificati</w:t>
+      </w:r>
+    </w:p>
+    <w:p>
+      <w:r>
+        <w:t>Processi consolidati di installazione e manutenzione: procedure operative standardizzate che garantiscono ripetibilità e qualità delle prestazioni</w:t>
+      </w:r>
+    </w:p>
+    <w:p>
+      <w:r>
+        <w:t>4.2 Fattori esterni</w:t>
+      </w:r>
+    </w:p>
+    <w:p>
+      <w:r>
+        <w:t>L'organizzazione tiene conto dei seguenti fattori esterni che possono impattare sulle proprie attività:</w:t>
+      </w:r>
+    </w:p>
+    <w:p>
+      <w:r>
+        <w:t>Evoluzione normativa FER: cambiamenti nelle politiche di incentivazione delle fonti energetiche rinnovabili e negli incentivi statali</w:t>
+      </w:r>
+    </w:p>
+    <w:p>
+      <w:r>
+        <w:t>Condizioni meteo e rischi climatici: impatto delle variazioni climatiche sulle operazioni di cantiere e sulle performance degli impianti</w:t>
+      </w:r>
+    </w:p>
+    <w:p>
+      <w:r>
+        <w:t>Innovazioni tecnologiche: introduzione di nuovi inverter, sistemi di monitoraggio avanzati e tecnologie di accumulo</w:t>
+      </w:r>
+    </w:p>
+    <w:p>
+      <w:r>
+        <w:t>Richieste dei clienti e dei gestori di rete: evoluzione delle aspettative del mercato e dei requisiti tecnici di connessione</w:t>
+      </w:r>
+    </w:p>
+    <w:p>
+      <w:r>
+        <w:t>4.3 Parti interessate</w:t>
+      </w:r>
+    </w:p>
+    <w:p>
+      <w:r>
+        <w:t>Le principali parti interessate e le relative aspettative sono identificate nella seguente tabella:</w:t>
+      </w:r>
+    </w:p>
+    <w:tbl>
+      <w:tblPr>
+        <w:tblStyle w:val="Tabellanormale"/>
+        <w:tblW w:type="auto" w:w="0"/>
+        <w:tblLook w:firstColumn="1" w:firstRow="1" w:lastColumn="0" w:lastRow="0" w:noHBand="0" w:noVBand="1" w:val="04A0"/>
+      </w:tblPr>
+      <w:tblGrid>
+        <w:gridCol w:w="4677"/>
+        <w:gridCol w:w="4677"/>
+      </w:tblGrid>
+      <w:tr>
+        <w:tc>
+          <w:tcPr>
+            <w:tcW w:type="dxa" w:w="4677"/>
+          </w:tcPr>
+          <w:p>
+            <w:r>
+              <w:t>Parte Interessata</w:t>
+            </w:r>
+          </w:p>
+        </w:tc>
+        <w:tc>
+          <w:tcPr>
+            <w:tcW w:type="dxa" w:w="4677"/>
+          </w:tcPr>
+          <w:p>
+            <w:r>
+              <w:t>Principali Aspettative</w:t>
+            </w:r>
+          </w:p>
+        </w:tc>
+      </w:tr>
+      <w:tr>
+        <w:tc>
+          <w:tcPr>
+            <w:tcW w:type="dxa" w:w="4677"/>
+          </w:tcPr>
+          <w:p>
+            <w:r>
+              <w:t>Clienti privati e aziendali</w:t>
+            </w:r>
+          </w:p>
+        </w:tc>
+        <w:tc>
+          <w:tcPr>
+            <w:tcW w:type="dxa" w:w="4677"/>
+          </w:tcPr>
+          <w:p>
+            <w:r>
+              <w:t>Qualità, tempistiche, sicurezza, risparmio energetico</w:t>
+            </w:r>
+          </w:p>
+        </w:tc>
+      </w:tr>
+      <w:tr>
+        <w:tc>
+          <w:tcPr>
+            <w:tcW w:type="dxa" w:w="4677"/>
+          </w:tcPr>
+          <w:p>
+            <w:r>
+              <w:t>EPC e General Contractor</w:t>
+            </w:r>
+          </w:p>
+        </w:tc>
+        <w:tc>
+          <w:tcPr>
+            <w:tcW w:type="dxa" w:w="4677"/>
+          </w:tcPr>
+          <w:p>
+            <w:r>
+              <w:t>Affidabilità, compliance normativa, documentazione</w:t>
+            </w:r>
+          </w:p>
+        </w:tc>
+      </w:tr>
+      <w:tr>
+        <w:tc>
+          <w:tcPr>
+            <w:tcW w:type="dxa" w:w="4677"/>
+          </w:tcPr>
+          <w:p>
+            <w:r>
+              <w:t>Fornitori e subappaltatori</w:t>
+            </w:r>
+          </w:p>
+        </w:tc>
+        <w:tc>
+          <w:tcPr>
+            <w:tcW w:type="dxa" w:w="4677"/>
+          </w:tcPr>
+          <w:p>
+            <w:r>
+              <w:t>Chiarezza nelle specifiche, pagamenti tempestivi</w:t>
+            </w:r>
+          </w:p>
+        </w:tc>
+      </w:tr>
+      <w:tr>
+        <w:tc>
+          <w:tcPr>
+            <w:tcW w:type="dxa" w:w="4677"/>
+          </w:tcPr>
+          <w:p>
+            <w:r>
+              <w:t>Personale interno ed esterno</w:t>
+            </w:r>
+          </w:p>
+        </w:tc>
+        <w:tc>
+          <w:tcPr>
+            <w:tcW w:type="dxa" w:w="4677"/>
+          </w:tcPr>
+          <w:p>
+            <w:r>
+              <w:t>Sicurezza, formazione, tutela della salute</w:t>
+            </w:r>
+          </w:p>
+        </w:tc>
+      </w:tr>
+      <w:tr>
+        <w:tc>
+          <w:tcPr>
+            <w:tcW w:type="dxa" w:w="4677"/>
+          </w:tcPr>
+          <w:p>
+            <w:r>
+              <w:t>Enti di controllo (ASL, ARPA, INAIL)</w:t>
+            </w:r>
+          </w:p>
+        </w:tc>
+        <w:tc>
+          <w:tcPr>
+            <w:tcW w:type="dxa" w:w="4677"/>
+          </w:tcPr>
+          <w:p>
+            <w:r>
+              <w:t>Conformità normativa, corretta gestione documentale</w:t>
+            </w:r>
+          </w:p>
+        </w:tc>
+      </w:tr>
+      <w:tr>
+        <w:tc>
+          <w:tcPr>
+            <w:tcW w:type="dxa" w:w="4677"/>
+          </w:tcPr>
+          <w:p>
+            <w:r>
+              <w:t>Gestori rifiuti RAEE</w:t>
+            </w:r>
+          </w:p>
+        </w:tc>
+        <w:tc>
+          <w:tcPr>
+            <w:tcW w:type="dxa" w:w="4677"/>
+          </w:tcPr>
+          <w:p>
+            <w:r>
+              <w:t>Corretta gestione dei rifiuti elettronici</w:t>
+            </w:r>
+          </w:p>
+        </w:tc>
+      </w:tr>
+      <w:tr>
+        <w:tc>
+          <w:tcPr>
+            <w:tcW w:type="dxa" w:w="4677"/>
+          </w:tcPr>
+          <w:p>
+            <w:r>
+              <w:t>Comunità locali</w:t>
+            </w:r>
+          </w:p>
+        </w:tc>
+        <w:tc>
+          <w:tcPr>
+            <w:tcW w:type="dxa" w:w="4677"/>
+          </w:tcPr>
+          <w:p>
+            <w:r>
+              <w:t>Impatto ambientale ridotto, sviluppo sostenibile</w:t>
+            </w:r>
+          </w:p>
+        </w:tc>
+      </w:tr>
+    </w:tbl>
+    <w:p>
+      <w:r/>
+    </w:p>
+    <w:p>
+      <w:r>
+        <w:t>4.4 Campo di applicazione del SGI</w:t>
+      </w:r>
+    </w:p>
+    <w:p>
+      <w:r>
+        <w:t>Il Sistema di Gestione Integrato copre tutte le attività operative, amministrative e di supporto, incluse le attività svolte presso cantieri temporanei e mobili. Il perimetro applicativo comprende la progettazione, installazione, manutenzione e monitoraggio di impianti fotovoltaici, nonché tutte le funzioni di supporto correlate.</w:t>
+        <w:br/>
+        <w:t>Il Sistema di Gestione Integrato è attuato attraverso un insieme strutturato di processi documentati nelle Schede Processo (P1–P14) e nelle Procedure Operative.</w:t>
+      </w:r>
+    </w:p>
+    <w:p>
+      <w:r>
+        <w:t>Per ciascun processo sono definiti:</w:t>
+      </w:r>
+    </w:p>
+    <w:p>
+      <w:r>
+        <w:t>• criteri operativi e metodi di controllo;</w:t>
+      </w:r>
+    </w:p>
+    <w:p>
+      <w:r>
+        <w:t>• indicatori di performance;</w:t>
+      </w:r>
+    </w:p>
+    <w:p>
+      <w:r>
+        <w:t>• responsabilità e autorità;</w:t>
+      </w:r>
+    </w:p>
+    <w:p>
+      <w:r>
+        <w:t>• registrazioni obbligatorie a supporto dell’evidenza;</w:t>
+      </w:r>
+    </w:p>
+    <w:p>
+      <w:r>
+        <w:t>• rischi e misure di controllo associati.</w:t>
+      </w:r>
+    </w:p>
+    <w:p>
+      <w:r>
+        <w:t>Le Procedure Operative e la Modulistica SGI costituiscono parte integrante del sistema e garantiscono la corretta applicazione dei processi.</w:t>
+      </w:r>
+    </w:p>
+    <w:p>
+      <w:r>
+        <w:t>Non sono previste esclusioni ai requisiti delle norme ISO 9001:2015, ISO 14001:2015 e ISO 45001:2018 applicabili al campo di applicazione sopra definito.</w:t>
+      </w:r>
+    </w:p>
+    <w:p>
+      <w:r>
+        <w:t>5. Leadership</w:t>
+      </w:r>
+    </w:p>
+    <w:p>
+      <w:r>
+        <w:t>5.1 Impegno della Direzione</w:t>
+      </w:r>
+    </w:p>
+    <w:p>
+      <w:r>
+        <w:t>La Direzione di Tresun S.r.l. dimostra il proprio impegno nei confronti del Sistema di Gestione Integrato attraverso azioni concrete e continuative. Il coinvolgimento attivo della leadership costituisce un fattore determinante per il successo e l'efficacia del SGI. In particolare, la Direzione assicura:</w:t>
+      </w:r>
+    </w:p>
+    <w:p>
+      <w:r>
+        <w:t>Disponibilità di risorse adeguate: allocamento delle risorse finanziarie, umane e tecnologiche necessarie per il funzionamento efficace del SGI</w:t>
+      </w:r>
+    </w:p>
+    <w:p>
+      <w:r>
+        <w:t>Definizione e diffusione della Politica Integrata: elaborazione e comunicazione di una politica che esprima gli impegni strategici dell'organizzazione</w:t>
+      </w:r>
+    </w:p>
+    <w:p>
+      <w:r>
+        <w:t>Promozione della cultura della qualità, sicurezza e sostenibilità: sensibilizzazione costante del personale verso i valori aziendali e gli obiettivi del SGI</w:t>
+      </w:r>
+    </w:p>
+    <w:p>
+      <w:r>
+        <w:t>Analisi periodica delle performance tramite Riesame: revisione sistematica dei risultati e definizione delle azioni di miglioramento</w:t>
+      </w:r>
+    </w:p>
+    <w:p>
+      <w:r>
+        <w:t>5.2 Politica Integrata</w:t>
+      </w:r>
+    </w:p>
+    <w:p>
+      <w:r>
+        <w:t>La Politica Integrata rappresenta il documento fondamentale che definisce gli impegni strategici di Tresun S.r.l. nei confronti della qualità, dell'ambiente e della sicurezza. La Politica è formalizzata, comunicata a tutti i livelli organizzativi e resa disponibile alle parti interessate. Essa definisce gli impegni aziendali in materia di:</w:t>
+      </w:r>
+    </w:p>
+    <w:tbl>
+      <w:tblPr>
+        <w:tblStyle w:val="Tabellanormale"/>
+        <w:tblW w:type="auto" w:w="0"/>
+        <w:tblLook w:firstColumn="1" w:firstRow="1" w:lastColumn="0" w:lastRow="0" w:noHBand="0" w:noVBand="1" w:val="04A0"/>
+      </w:tblPr>
+      <w:tblGrid>
+        <w:gridCol w:w="2338"/>
+        <w:gridCol w:w="2338"/>
+        <w:gridCol w:w="2338"/>
+        <w:gridCol w:w="2338"/>
+      </w:tblGrid>
+      <w:tr>
+        <w:tc>
+          <w:tcPr>
+            <w:tcW w:type="dxa" w:w="2338"/>
+          </w:tcPr>
+          <w:p>
+            <w:r>
+              <w:t>QUALITÀ</w:t>
+            </w:r>
+          </w:p>
+        </w:tc>
+        <w:tc>
+          <w:tcPr>
+            <w:tcW w:type="dxa" w:w="2338"/>
+          </w:tcPr>
+          <w:p>
+            <w:r>
+              <w:t>AMBIENTE</w:t>
+            </w:r>
+          </w:p>
+        </w:tc>
+        <w:tc>
+          <w:tcPr>
+            <w:tcW w:type="dxa" w:w="2338"/>
+          </w:tcPr>
+          <w:p>
+            <w:r>
+              <w:t>SICUREZZA</w:t>
+            </w:r>
+          </w:p>
+        </w:tc>
+        <w:tc>
+          <w:tcPr>
+            <w:tcW w:type="dxa" w:w="2338"/>
+          </w:tcPr>
+          <w:p>
+            <w:r>
+              <w:t>TRASVERSALE</w:t>
+            </w:r>
+          </w:p>
+        </w:tc>
+      </w:tr>
+      <w:tr>
+        <w:tc>
+          <w:tcPr>
+            <w:tcW w:type="dxa" w:w="2338"/>
+          </w:tcPr>
+          <w:p>
+            <w:r>
+              <w:t>Soddisfazione del cliente</w:t>
+            </w:r>
+          </w:p>
+        </w:tc>
+        <w:tc>
+          <w:tcPr>
+            <w:tcW w:type="dxa" w:w="2338"/>
+          </w:tcPr>
+          <w:p>
+            <w:r>
+              <w:t>Prevenzione dell'inquinamento</w:t>
+            </w:r>
+          </w:p>
+        </w:tc>
+        <w:tc>
+          <w:tcPr>
+            <w:tcW w:type="dxa" w:w="2338"/>
+          </w:tcPr>
+          <w:p>
+            <w:r>
+              <w:t>Tutela della salute</w:t>
+            </w:r>
+          </w:p>
+        </w:tc>
+        <w:tc>
+          <w:tcPr>
+            <w:tcW w:type="dxa" w:w="2338"/>
+          </w:tcPr>
+          <w:p>
+            <w:r>
+              <w:t>Rispetto della normativa</w:t>
+            </w:r>
+          </w:p>
+        </w:tc>
+      </w:tr>
+      <w:tr>
+        <w:tc>
+          <w:tcPr>
+            <w:tcW w:type="dxa" w:w="2338"/>
+          </w:tcPr>
+          <w:p>
+            <w:r>
+              <w:t>Eccellenza operativa</w:t>
+            </w:r>
+          </w:p>
+        </w:tc>
+        <w:tc>
+          <w:tcPr>
+            <w:tcW w:type="dxa" w:w="2338"/>
+          </w:tcPr>
+          <w:p>
+            <w:r>
+              <w:t>Uso efficiente risorse</w:t>
+            </w:r>
+          </w:p>
+        </w:tc>
+        <w:tc>
+          <w:tcPr>
+            <w:tcW w:type="dxa" w:w="2338"/>
+          </w:tcPr>
+          <w:p>
+            <w:r>
+              <w:t>Prevenzione infortuni</w:t>
+            </w:r>
+          </w:p>
+        </w:tc>
+        <w:tc>
+          <w:tcPr>
+            <w:tcW w:type="dxa" w:w="2338"/>
+          </w:tcPr>
+          <w:p>
+            <w:r>
+              <w:t>Miglioramento continuo</w:t>
+            </w:r>
+          </w:p>
+        </w:tc>
+      </w:tr>
+    </w:tbl>
+    <w:p>
+      <w:r>
+        <w:t>5.3 Ruoli, responsabilità e autorità</w:t>
+      </w:r>
+    </w:p>
+    <w:p>
+      <w:r>
+        <w:t>La Direzione mantiene aggiornato l’Organigramma del Sistema di Gestione Integrato, nel quale sono riportati ruoli, responsabilità e autorità per qualità, ambiente e sicurezza.</w:t>
+      </w:r>
+    </w:p>
+    <w:p>
+      <w:r>
+        <w:t>Le responsabilità operative e gestionali sono definite nel documento ‘ORG-SGI-01 – Organigramma e Mansionario SGI’, che costituisce parte integrante del presente Manuale.</w:t>
+      </w:r>
+    </w:p>
+    <w:p>
+      <w:r>
+        <w:t>5.4 Consultazione e partecipazione dei lavoratori</w:t>
+      </w:r>
+    </w:p>
+    <w:p>
+      <w:r>
+        <w:t>Tresun S.r.l. garantisce la consultazione e la partecipazione attiva dei lavoratori e dei loro rappresentanti in materia di salute e sicurezza sul lavoro.</w:t>
+      </w:r>
+    </w:p>
+    <w:p>
+      <w:r>
+        <w:t>Tale partecipazione avviene attraverso:</w:t>
+      </w:r>
+    </w:p>
+    <w:p>
+      <w:r>
+        <w:t>• riunioni periodiche con RLS;</w:t>
+      </w:r>
+    </w:p>
+    <w:p>
+      <w:r>
+        <w:t>• consultazione preventiva su modifiche rilevanti;</w:t>
+      </w:r>
+    </w:p>
+    <w:p>
+      <w:r>
+        <w:t>• segnalazioni volontarie di pericoli e near miss;</w:t>
+      </w:r>
+    </w:p>
+    <w:p>
+      <w:r>
+        <w:t>• coinvolgimento nella definizione delle misure di prevenzione.</w:t>
+      </w:r>
+    </w:p>
+    <w:p>
+      <w:r>
+        <w:t>Le modalità operative sono definite nella procedura ‘PROC-CP-01 – Consultazione e Partecipazione dei Lavoratori’.</w:t>
+      </w:r>
+    </w:p>
+    <w:p>
+      <w:r>
+        <w:t>6. Pianificazione</w:t>
+      </w:r>
+    </w:p>
+    <w:p>
+      <w:r>
+        <w:t>6.1 Rischi e opportunità</w:t>
+      </w:r>
+    </w:p>
+    <w:p>
+      <w:r>
+        <w:t>Tresun S.r.l. ha implementato un approccio sistematico per l'identificazione, la valutazione e la gestione dei rischi e delle opportunità. L'organizzazione utilizza una matrice integrata che consente una visione d'insieme delle diverse tipologie di rischio, facilitando l'adozione di misure di controllo efficaci e coordinate. La metodologia di valutazione adottata è definita nella procedura PROC-RIS-01 Identificazione e Valutazione dei Rischi e Opportunità, che stabilisce i criteri di stima della probabilità e della gravità/impatto, le soglie di accettabilità e le modalità di trattamento per ciascuna area (qualità, ambiente, sicurezza). Per ISO 14001, la valutazione include esplicitamente le condizioni operative normali, anomale e di emergenza. La matrice comprende:</w:t>
+      </w:r>
+    </w:p>
+    <w:p>
+      <w:r>
+        <w:t>Rischi di processo (qualità): analisi delle potenziali non conformità, ritardi nelle consegne, inefficienze operative e scostamenti dalle specifiche tecniche</w:t>
+      </w:r>
+    </w:p>
+    <w:p>
+      <w:r>
+        <w:t>Aspetti ambientali significativi: valutazione degli impatti ambientali associati alle attività di cantiere, gestione dei rifiuti RAEE, consumo di risorse e emissioni</w:t>
+      </w:r>
+    </w:p>
+    <w:p>
+      <w:r>
+        <w:t>Pericoli e rischi per la sicurezza: identificazione dei rischi specifici del settore elettrico, lavori in quota, movimentazione carichi e attività di cantiere</w:t>
+      </w:r>
+    </w:p>
+    <w:p>
+      <w:r>
+        <w:t>I risultati della Matrice dei Rischi Integrata sono collegati al Registro degli Aspetti Ambientali (RAA-SGI-01) e al Registro dei Requisiti Legali e Altri Requisiti (LEG-SGI-01).</w:t>
+      </w:r>
+    </w:p>
+    <w:p>
+      <w:r>
+        <w:t>Per ogni rischio significativo e per ogni opportunità identificata viene definito un Piano di Azione con responsabilità, tempistiche e modalità di verifica dell’efficacia.</w:t>
+      </w:r>
+    </w:p>
+    <w:p>
+      <w:r>
+        <w:t>Il monitoraggio delle azioni è effettuato periodicamente dal Responsabile SGI e discusso nel Riesame della Direzione.</w:t>
+      </w:r>
+    </w:p>
+    <w:p>
+      <w:r>
+        <w:t>6.2 Obiettivi integrati</w:t>
+      </w:r>
+    </w:p>
+    <w:p>
+      <w:r>
+        <w:t>Gli obiettivi del Sistema di Gestione Integrato sono definiti annualmente attraverso un processo strutturato che tiene conto delle priorità strategiche, dei risultati degli audit e delle indicazioni del Riesame della Direzione. Gli obiettivi sono misurabili, monitorati e comunicati a tutti i livelli organizzativi. Le principali aree di intervento riguardano:</w:t>
+      </w:r>
+    </w:p>
+    <w:tbl>
+      <w:tblPr>
+        <w:tblStyle w:val="Tabellanormale"/>
+        <w:tblW w:type="auto" w:w="0"/>
+        <w:tblLook w:firstColumn="1" w:firstRow="1" w:lastColumn="0" w:lastRow="0" w:noHBand="0" w:noVBand="1" w:val="04A0"/>
+      </w:tblPr>
+      <w:tblGrid>
+        <w:gridCol w:w="2338"/>
+        <w:gridCol w:w="2338"/>
+        <w:gridCol w:w="2338"/>
+        <w:gridCol w:w="2338"/>
+      </w:tblGrid>
+      <w:tr>
+        <w:tc>
+          <w:tcPr>
+            <w:tcW w:type="dxa" w:w="2338"/>
+          </w:tcPr>
+          <w:p>
+            <w:r>
+              <w:t>QUALITÀ</w:t>
+            </w:r>
+          </w:p>
+        </w:tc>
+        <w:tc>
+          <w:tcPr>
+            <w:tcW w:type="dxa" w:w="2338"/>
+          </w:tcPr>
+          <w:p>
+            <w:r>
+              <w:t>AMBIENTE</w:t>
+            </w:r>
+          </w:p>
+        </w:tc>
+        <w:tc>
+          <w:tcPr>
+            <w:tcW w:type="dxa" w:w="2338"/>
+          </w:tcPr>
+          <w:p>
+            <w:r>
+              <w:t>SICUREZZA</w:t>
+            </w:r>
+          </w:p>
+        </w:tc>
+        <w:tc>
+          <w:tcPr>
+            <w:tcW w:type="dxa" w:w="2338"/>
+          </w:tcPr>
+          <w:p>
+            <w:r>
+              <w:t>EFFICIENZA</w:t>
+            </w:r>
+          </w:p>
+        </w:tc>
+      </w:tr>
+      <w:tr>
+        <w:tc>
+          <w:tcPr>
+            <w:tcW w:type="dxa" w:w="2338"/>
+          </w:tcPr>
+          <w:p>
+            <w:r>
+              <w:t>Riduzione NC tecniche</w:t>
+            </w:r>
+          </w:p>
+        </w:tc>
+        <w:tc>
+          <w:tcPr>
+            <w:tcW w:type="dxa" w:w="2338"/>
+          </w:tcPr>
+          <w:p>
+            <w:r>
+              <w:t>Miglioramento gestione RAEE</w:t>
+            </w:r>
+          </w:p>
+        </w:tc>
+        <w:tc>
+          <w:tcPr>
+            <w:tcW w:type="dxa" w:w="2338"/>
+          </w:tcPr>
+          <w:p>
+            <w:r>
+              <w:t>Riduzione near miss</w:t>
+            </w:r>
+          </w:p>
+        </w:tc>
+        <w:tc>
+          <w:tcPr>
+            <w:tcW w:type="dxa" w:w="2338"/>
+          </w:tcPr>
+          <w:p>
+            <w:r>
+              <w:t>Miglioramento tempi intervento</w:t>
+            </w:r>
+          </w:p>
+        </w:tc>
+      </w:tr>
+      <w:tr>
+        <w:tc>
+          <w:tcPr>
+            <w:tcW w:type="dxa" w:w="2338"/>
+          </w:tcPr>
+          <w:p>
+            <w:r>
+              <w:t>Aumento soddisfazione clienti</w:t>
+            </w:r>
+          </w:p>
+        </w:tc>
+        <w:tc>
+          <w:tcPr>
+            <w:tcW w:type="dxa" w:w="2338"/>
+          </w:tcPr>
+          <w:p>
+            <w:r>
+              <w:t>Riduzione sprechi materiali</w:t>
+            </w:r>
+          </w:p>
+        </w:tc>
+        <w:tc>
+          <w:tcPr>
+            <w:tcW w:type="dxa" w:w="2338"/>
+          </w:tcPr>
+          <w:p>
+            <w:r>
+              <w:t>Zero infortuni</w:t>
+            </w:r>
+          </w:p>
+        </w:tc>
+        <w:tc>
+          <w:tcPr>
+            <w:tcW w:type="dxa" w:w="2338"/>
+          </w:tcPr>
+          <w:p>
+            <w:r>
+              <w:t>Ottimizzazione costi</w:t>
+            </w:r>
+          </w:p>
+        </w:tc>
+      </w:tr>
+    </w:tbl>
+    <w:p>
+      <w:r/>
+    </w:p>
+    <w:p>
+      <w:r>
+        <w:t>Gli obiettivi del Sistema di Gestione Integrato sono formalizzati nel documento ‘OBJ-SGI-01 – Piano Obiettivi e Indicatori SGI’, che definisce per ciascun obiettivo:</w:t>
+      </w:r>
+    </w:p>
+    <w:p>
+      <w:r>
+        <w:t>• indicatore associato;</w:t>
+      </w:r>
+    </w:p>
+    <w:p>
+      <w:r>
+        <w:t>• valore di riferimento (baseline);</w:t>
+      </w:r>
+    </w:p>
+    <w:p>
+      <w:r>
+        <w:t>• target misurabile;</w:t>
+      </w:r>
+    </w:p>
+    <w:p>
+      <w:r>
+        <w:t>• responsabile;</w:t>
+      </w:r>
+    </w:p>
+    <w:p>
+      <w:r>
+        <w:t>• tempistiche;</w:t>
+      </w:r>
+    </w:p>
+    <w:p>
+      <w:r>
+        <w:t>• azioni necessarie;</w:t>
+      </w:r>
+    </w:p>
+    <w:p>
+      <w:r>
+        <w:t>• modalità di monitoraggio.</w:t>
+      </w:r>
+    </w:p>
+    <w:p>
+      <w:r>
+        <w:t>I risultati sono analizzati con frequenza almeno trimestrale.</w:t>
+      </w:r>
+    </w:p>
+    <w:p>
+      <w:r>
+        <w:t>6.3 Gestione del cambiamento</w:t>
+      </w:r>
+    </w:p>
+    <w:p>
+      <w:r>
+        <w:t>Tresun S.r.l. gestisce in modo controllato tutte le modifiche pianificate che possono avere impatti sul Sistema di Gestione Integrato, sui processi, sulle risorse, sulla conformità normativa o sulle prestazioni in materia di qualità, ambiente e sicurezza.</w:t>
+      </w:r>
+    </w:p>
+    <w:p>
+      <w:r>
+        <w:t>La valutazione preventiva delle modifiche è effettuata secondo la procedura PROC-MOC-01 – Gestione del Cambiamento, che definisce:</w:t>
+      </w:r>
+    </w:p>
+    <w:p>
+      <w:r>
+        <w:t>• la descrizione della modifica proposta;</w:t>
+      </w:r>
+    </w:p>
+    <w:p>
+      <w:r>
+        <w:t>• l’analisi degli impatti su rischi, aspetti ambientali e requisiti di sicurezza;</w:t>
+      </w:r>
+    </w:p>
+    <w:p>
+      <w:r>
+        <w:t>• la verifica della disponibilità delle risorse necessarie;</w:t>
+      </w:r>
+    </w:p>
+    <w:p>
+      <w:r>
+        <w:t>• l’aggiornamento della documentazione interessata;</w:t>
+      </w:r>
+    </w:p>
+    <w:p>
+      <w:r>
+        <w:t>• la comunicazione interna ed esterna;</w:t>
+      </w:r>
+    </w:p>
+    <w:p>
+      <w:r>
+        <w:t>• la verifica dell’efficacia della modifica implementata.</w:t>
+      </w:r>
+    </w:p>
+    <w:p>
+      <w:r>
+        <w:t>Le modifiche approvate sono registrate nel Registro Cambiamenti SGI (REG-MOC-01) e riesaminate periodicamente dal Responsabile SGI e dalla Direzione.</w:t>
+      </w:r>
+    </w:p>
+    <w:p>
+      <w:r>
+        <w:t>7. Supporto</w:t>
+      </w:r>
+    </w:p>
+    <w:p>
+      <w:r>
+        <w:t>7.1 Risorse</w:t>
+      </w:r>
+    </w:p>
+    <w:p>
+      <w:r>
+        <w:t>L'organizzazione assicura la disponibilità delle risorse necessarie per l'implementazione, il mantenimento e il miglioramento continuo del Sistema di Gestione Integrato. Le risorse comprendono personale qualificato con competenze specifiche nel settore fotovoltaico, attrezzature e strumenti di misura calibrati e certificati, dispositivi di protezione individuale conformi alle normative vigenti, e software di monitoraggio per la gestione degli impianti e la tracciabilità delle attività.</w:t>
+      </w:r>
+    </w:p>
+    <w:p>
+      <w:r>
+        <w:t>Gli strumenti di misura utilizzati per installazione, manutenzione e verifiche elettriche sono gestiti secondo la procedura ‘PROC-TAR-01 – Gestione Strumenti di Misura’.</w:t>
+      </w:r>
+    </w:p>
+    <w:p>
+      <w:r>
+        <w:t>Per ciascuno strumento sono mantenuti:</w:t>
+      </w:r>
+    </w:p>
+    <w:p>
+      <w:r>
+        <w:t>• registro tarature;</w:t>
+      </w:r>
+    </w:p>
+    <w:p>
+      <w:r>
+        <w:t>• certificati di taratura;</w:t>
+      </w:r>
+    </w:p>
+    <w:p>
+      <w:r>
+        <w:t>• stato di conformità;</w:t>
+      </w:r>
+    </w:p>
+    <w:p>
+      <w:r>
+        <w:t>• identificazione univoca.</w:t>
+      </w:r>
+    </w:p>
+    <w:p>
+      <w:r>
+        <w:t>7.2 Competenze</w:t>
+      </w:r>
+    </w:p>
+    <w:p>
+      <w:r>
+        <w:t>La formazione rappresenta un elemento strategico per garantire le competenze necessarie allo svolgimento delle attività. Tresun S.r.l. assicura percorsi formativi obbligatori e specialistici, con particolare attenzione alle seguenti aree:</w:t>
+      </w:r>
+    </w:p>
+    <w:tbl>
+      <w:tblPr>
+        <w:tblStyle w:val="Tabellanormale"/>
+        <w:tblW w:type="auto" w:w="0"/>
+        <w:tblLook w:firstColumn="1" w:firstRow="1" w:lastColumn="0" w:lastRow="0" w:noHBand="0" w:noVBand="1" w:val="04A0"/>
+      </w:tblPr>
+      <w:tblGrid>
+        <w:gridCol w:w="4677"/>
+        <w:gridCol w:w="4677"/>
+      </w:tblGrid>
+      <w:tr>
+        <w:tc>
+          <w:tcPr>
+            <w:tcW w:type="dxa" w:w="4677"/>
+          </w:tcPr>
+          <w:p>
+            <w:r>
+              <w:t>Area Formativa</w:t>
+            </w:r>
+          </w:p>
+        </w:tc>
+        <w:tc>
+          <w:tcPr>
+            <w:tcW w:type="dxa" w:w="4677"/>
+          </w:tcPr>
+          <w:p>
+            <w:r>
+              <w:t>Contenuti</w:t>
+            </w:r>
+          </w:p>
+        </w:tc>
+      </w:tr>
+      <w:tr>
+        <w:tc>
+          <w:tcPr>
+            <w:tcW w:type="dxa" w:w="4677"/>
+          </w:tcPr>
+          <w:p>
+            <w:r>
+              <w:t>Lavori elettrici (PES/PAV)</w:t>
+            </w:r>
+          </w:p>
+        </w:tc>
+        <w:tc>
+          <w:tcPr>
+            <w:tcW w:type="dxa" w:w="4677"/>
+          </w:tcPr>
+          <w:p>
+            <w:r>
+              <w:t>Qualifiche per lavori sotto tensione, procedure di sicurezza elettrica</w:t>
+            </w:r>
+          </w:p>
+        </w:tc>
+      </w:tr>
+      <w:tr>
+        <w:tc>
+          <w:tcPr>
+            <w:tcW w:type="dxa" w:w="4677"/>
+          </w:tcPr>
+          <w:p>
+            <w:r>
+              <w:t>Lavori in quota</w:t>
+            </w:r>
+          </w:p>
+        </w:tc>
+        <w:tc>
+          <w:tcPr>
+            <w:tcW w:type="dxa" w:w="4677"/>
+          </w:tcPr>
+          <w:p>
+            <w:r>
+              <w:t>Utilizzo DPI anticaduta, procedure di accesso e posizionamento</w:t>
+            </w:r>
+          </w:p>
+        </w:tc>
+      </w:tr>
+      <w:tr>
+        <w:tc>
+          <w:tcPr>
+            <w:tcW w:type="dxa" w:w="4677"/>
+          </w:tcPr>
+          <w:p>
+            <w:r>
+              <w:t>Sicurezza cantieri</w:t>
+            </w:r>
+          </w:p>
+        </w:tc>
+        <w:tc>
+          <w:tcPr>
+            <w:tcW w:type="dxa" w:w="4677"/>
+          </w:tcPr>
+          <w:p>
+            <w:r>
+              <w:t>D.Lgs. 81/08, PSC, POS, gestione emergenze</w:t>
+            </w:r>
+          </w:p>
+        </w:tc>
+      </w:tr>
+      <w:tr>
+        <w:tc>
+          <w:tcPr>
+            <w:tcW w:type="dxa" w:w="4677"/>
+          </w:tcPr>
+          <w:p>
+            <w:r>
+              <w:t>Gestione rifiuti</w:t>
+            </w:r>
+          </w:p>
+        </w:tc>
+        <w:tc>
+          <w:tcPr>
+            <w:tcW w:type="dxa" w:w="4677"/>
+          </w:tcPr>
+          <w:p>
+            <w:r>
+              <w:t>Classificazione, stoccaggio, smaltimento RAEE, registri</w:t>
+            </w:r>
+          </w:p>
+        </w:tc>
+      </w:tr>
+    </w:tbl>
+    <w:p>
+      <w:r/>
+    </w:p>
+    <w:p>
+      <w:r>
+        <w:t>Le competenze richieste per ciascun ruolo sono definite nella Matrice Competenze (COMP-SGI-01).</w:t>
+      </w:r>
+    </w:p>
+    <w:p>
+      <w:r>
+        <w:t>La formazione erogata è registrata nel Registro Formazione (REG-FOR-01) e la sua efficacia è verificata tramite test, osservazioni in campo e risultati degli audit.</w:t>
+      </w:r>
+    </w:p>
+    <w:p>
+      <w:r>
+        <w:t>7.3 Consapevolezza</w:t>
+      </w:r>
+    </w:p>
+    <w:p>
+      <w:r>
+        <w:t>Tresun S.r.l. assicura che il personale sia consapevole di:</w:t>
+      </w:r>
+    </w:p>
+    <w:p>
+      <w:r>
+        <w:t>a) politica integrata e obiettivi SGI;</w:t>
+      </w:r>
+    </w:p>
+    <w:p>
+      <w:r>
+        <w:t>b) proprio contributo all'efficacia del SGI, inclusi benefici di un miglioramento delle prestazioni;</w:t>
+      </w:r>
+    </w:p>
+    <w:p>
+      <w:r>
+        <w:t>c) implicazioni della non conformità ai requisiti del SGI;</w:t>
+      </w:r>
+    </w:p>
+    <w:p>
+      <w:r>
+        <w:t>d) pericoli specifici del proprio ruolo e misure di controllo;</w:t>
+      </w:r>
+    </w:p>
+    <w:p>
+      <w:r>
+        <w:t>e) impatti ambientali significativi delle proprie attività.</w:t>
+      </w:r>
+    </w:p>
+    <w:p>
+      <w:r>
+        <w:t>La consapevolezza è verificata tramite colloqui di ingresso, briefing pre-lavoro e test di verifica (REG-FOR-01).</w:t>
+      </w:r>
+    </w:p>
+    <w:p>
+      <w:r>
+        <w:t>7.4 Comunicazione</w:t>
+      </w:r>
+    </w:p>
+    <w:p>
+      <w:r>
+        <w:t>La comunicazione interna ed esterna è gestita attraverso procedure definite che ne garantiscono l'efficacia e la tracciabilità. La comunicazione interna riguarda principalmente la diffusione della Politica Integrata, gli aggiornamenti procedurali, i risultati degli audit e le azioni di miglioramento. La comunicazione esterna comprende le relazioni con clienti, fornitori, enti di controllo e altre parti interessate, con particolare attenzione alla gestione delle emergenze e delle segnalazioni.</w:t>
+      </w:r>
+    </w:p>
+    <w:p>
+      <w:r>
+        <w:t>La comunicazione interna ed esterna è pianificata attraverso la Matrice di Comunicazione SGI (COM-SGI-01), che definisce:</w:t>
+      </w:r>
+    </w:p>
+    <w:p>
+      <w:r>
+        <w:t>• destinatari;</w:t>
+      </w:r>
+    </w:p>
+    <w:p>
+      <w:r>
+        <w:t>• contenuti;</w:t>
+      </w:r>
+    </w:p>
+    <w:p>
+      <w:r>
+        <w:t>• modalità;</w:t>
+      </w:r>
+    </w:p>
+    <w:p>
+      <w:r>
+        <w:t>• frequenza;</w:t>
+      </w:r>
+    </w:p>
+    <w:p>
+      <w:r>
+        <w:t>• responsabilità.</w:t>
+      </w:r>
+    </w:p>
+    <w:p>
+      <w:r>
+        <w:t>7.5 Informazioni documentate</w:t>
+      </w:r>
+    </w:p>
+    <w:p>
+      <w:r>
+        <w:t>Il Sistema di Gestione Integrato prevede una struttura documentale organica e gerarchica che comprende:</w:t>
+      </w:r>
+    </w:p>
+    <w:p>
+      <w:r>
+        <w:t>Procedure integrate: documenti che descrivono i processi e le interazioni tra i tre sistemi di gestione</w:t>
+      </w:r>
+    </w:p>
+    <w:p>
+      <w:r>
+        <w:t>Istruzioni operative: documenti di dettaglio per l'esecuzione delle attività specifiche</w:t>
+      </w:r>
+    </w:p>
+    <w:p>
+      <w:r>
+        <w:t>Moduli e registri: forme per la registrazione delle attività, delle verifiche e delle misurazioni</w:t>
+      </w:r>
+    </w:p>
+    <w:p>
+      <w:r>
+        <w:t>Documenti di cantiere: documentazione specifica per la gestione operativa dei cantieri temporanei e mobili</w:t>
+      </w:r>
+    </w:p>
+    <w:p>
+      <w:r>
+        <w:t xml:space="preserve">La gestione delle informazioni documentate è regolata dalla procedura ‘PROC-DOC-01 – Gestione Documenti e Registrazioni’, che definisce: </w:t>
+      </w:r>
+    </w:p>
+    <w:p>
+      <w:r>
+        <w:t xml:space="preserve">• codifica; </w:t>
+      </w:r>
+    </w:p>
+    <w:p>
+      <w:r>
+        <w:t xml:space="preserve">• approvazione; </w:t>
+      </w:r>
+    </w:p>
+    <w:p>
+      <w:r>
+        <w:t xml:space="preserve">• revisione; </w:t>
+      </w:r>
+    </w:p>
+    <w:p>
+      <w:r>
+        <w:t xml:space="preserve">• distribuzione controllata; </w:t>
+      </w:r>
+    </w:p>
+    <w:p>
+      <w:r>
+        <w:t xml:space="preserve">• gestione documenti obsoleti; </w:t>
+      </w:r>
+    </w:p>
+    <w:p>
+      <w:r>
+        <w:t>• tempi di conservazione delle registrazioni.</w:t>
+      </w:r>
+    </w:p>
+    <w:p>
+      <w:r>
+        <w:t>8. Attività operative</w:t>
+      </w:r>
+    </w:p>
+    <w:p>
+      <w:r>
+        <w:t>8.1 Pianificazione operativa</w:t>
+      </w:r>
+    </w:p>
+    <w:p>
+      <w:r>
+        <w:t>La pianificazione operativa costituisce la fase preliminare essenziale per garantire l'esecuzione delle attività in condizioni di sicurezza e nel rispetto dei requisiti di qualità e ambientali. Essa comprende la gestione dei cantieri con definizione di layout, aree di stoccaggio e percorsi, l'acquisizione dei permessi necessari per l'esecuzione dei lavori, la valutazione dei rischi specifici con definizione delle misure di prevenzione e protezione, e la gestione dei rifiuti prevista con individuazione delle modalità di raccolta e smaltimento.</w:t>
+      </w:r>
+    </w:p>
+    <w:p>
+      <w:r>
+        <w:t>8.2 Determinazione dei requisiti per i prodotti e servizi</w:t>
+      </w:r>
+    </w:p>
+    <w:p>
+      <w:r>
+        <w:t>8.2.1 Generalità</w:t>
+      </w:r>
+    </w:p>
+    <w:p>
+      <w:r>
+        <w:t>Tresun S.r.l. ha implementato un processo strutturato per la determinazione, revisione e gestione dei requisiti relativi ai servizi di installazione, manutenzione e monitoraggio impianti fotovoltaici.</w:t>
+      </w:r>
+    </w:p>
+    <w:p>
+      <w:r>
+        <w:t>8.2.2 Determinazione dei requisiti</w:t>
+      </w:r>
+    </w:p>
+    <w:p>
+      <w:r>
+        <w:t>Prima della formulazione dell'offerta, Tresun determina:</w:t>
+      </w:r>
+    </w:p>
+    <w:p>
+      <w:r>
+        <w:t>• requisiti specificati dal cliente: potenza impianto, tipologia moduli, presenza accumulo, connessione rete;</w:t>
+      </w:r>
+    </w:p>
+    <w:p>
+      <w:r>
+        <w:t>• requisiti non espressi ma necessari: idoneità strutturale edificio, esposizione solare, vincoli urbanistici;</w:t>
+      </w:r>
+    </w:p>
+    <w:p>
+      <w:r>
+        <w:t>• requisiti legali e normativi: norme CEI, requisiti GSE, autorizzazioni paesaggistiche, connessione alla rete elettrica;</w:t>
+      </w:r>
+    </w:p>
+    <w:p>
+      <w:r>
+        <w:t>• requisiti aggiuntivi: garanzie estese, manutenzione programmata, monitoraggio remoto.</w:t>
+      </w:r>
+    </w:p>
+    <w:p>
+      <w:r>
+        <w:t>La verifica di fattibilità tecnica include sopralluogo tecnico, analisi consumi storici, simulazione produzione energetica, verifica vincoli di connessione.</w:t>
+      </w:r>
+    </w:p>
+    <w:p>
+      <w:r>
+        <w:t>8.2.3 Revisione dei requisiti</w:t>
+      </w:r>
+    </w:p>
+    <w:p>
+      <w:r>
+        <w:t>Ogni offerta e contratto è sottoposto a revisione formale prima dell'accettazione per assicurare:</w:t>
+      </w:r>
+    </w:p>
+    <w:p>
+      <w:r>
+        <w:t>• completezza e chiarezza dei requisiti;</w:t>
+      </w:r>
+    </w:p>
+    <w:p>
+      <w:r>
+        <w:t>• assenza di contraddizioni tra specifiche tecniche, offerta economica e condizioni contrattuali;</w:t>
+      </w:r>
+    </w:p>
+    <w:p>
+      <w:r>
+        <w:t>• capacità di Tresun di soddisfare i requisiti;</w:t>
+      </w:r>
+    </w:p>
+    <w:p>
+      <w:r>
+        <w:t>• identificazione e gestione dei rischi.</w:t>
+      </w:r>
+    </w:p>
+    <w:p>
+      <w:r>
+        <w:t>Le revisioni sono documentate nel REG-COM-01 - Registro Revisioni Offerte e Contratti.</w:t>
+      </w:r>
+    </w:p>
+    <w:p>
+      <w:r>
+        <w:t>8.2.4 Gestione delle modifiche</w:t>
+      </w:r>
+    </w:p>
+    <w:p>
+      <w:r>
+        <w:t>Le modifiche contrattuali post-ordine sono gestite tramite richiesta scritta, valutazione impatto, approvazione formale, aggiornamento documentazione, comunicazione ai subappaltatori/fornitori.</w:t>
+      </w:r>
+    </w:p>
+    <w:p>
+      <w:r>
+        <w:t>Procedure correlate: PROC-COM-01 - Gestione Commerciale e Requisiti Cliente.</w:t>
+      </w:r>
+    </w:p>
+    <w:p>
+      <w:r/>
+    </w:p>
+    <w:p>
+      <w:r>
+        <w:t>8.3 Progettazione e sviluppo</w:t>
+      </w:r>
+    </w:p>
+    <w:p>
+      <w:r>
+        <w:t>8.3.1 Generalità</w:t>
+      </w:r>
+    </w:p>
+    <w:p>
+      <w:r>
+        <w:t>Tresun S.r.l. gestisce la progettazione degli impianti fotovoltaici attraverso un processo strutturato che assicura la conformità ai requisiti del cliente e alle normative applicabili.</w:t>
+      </w:r>
+    </w:p>
+    <w:p>
+      <w:r>
+        <w:t>8.3.2 Input di progettazione</w:t>
+      </w:r>
+    </w:p>
+    <w:p>
+      <w:r>
+        <w:t>Per ciascun progetto sono definiti e documentati gli input:</w:t>
+      </w:r>
+    </w:p>
+    <w:p>
+      <w:r>
+        <w:t>• dati anagrafici cliente e ubicazione impianto;</w:t>
+      </w:r>
+    </w:p>
+    <w:p>
+      <w:r>
+        <w:t>• rilievi tecnici in loco (orientamento, inclinazione, ombreggiamenti);</w:t>
+      </w:r>
+    </w:p>
+    <w:p>
+      <w:r>
+        <w:t>• consumi elettrici storici e profilo di carico;</w:t>
+      </w:r>
+    </w:p>
+    <w:p>
+      <w:r>
+        <w:t>• documentazione catastale e planimetrie edificio;</w:t>
+      </w:r>
+    </w:p>
+    <w:p>
+      <w:r>
+        <w:t>• vincoli urbanistici e paesaggistici;</w:t>
+      </w:r>
+    </w:p>
+    <w:p>
+      <w:r>
+        <w:t>• requisiti di connessione alla rete (BT/MT);</w:t>
+      </w:r>
+    </w:p>
+    <w:p>
+      <w:r>
+        <w:t>• normativa applicabile (CEI 0-16, CEI 0-21, UNI 9177 se richiesto).</w:t>
+      </w:r>
+    </w:p>
+    <w:p>
+      <w:r>
+        <w:t>8.3.3 Processo di progettazione</w:t>
+      </w:r>
+    </w:p>
+    <w:p>
+      <w:r>
+        <w:t>La progettazione è sviluppata in fasi controllate:</w:t>
+      </w:r>
+    </w:p>
+    <w:p>
+      <w:r>
+        <w:t>1. Progetto preliminare: dimensionamento, scelta componenti, simulazione produttiva, analisi economica;</w:t>
+      </w:r>
+    </w:p>
+    <w:p>
+      <w:r>
+        <w:t>2. Progetto definitivo: layout moduli, schema elettrico unifilare, scelta inverter, sistema monitoraggio;</w:t>
+      </w:r>
+    </w:p>
+    <w:p>
+      <w:r>
+        <w:t>3. Progetto esecutivo: dettagli installazione, distinte materiali, piani di montaggio, pratiche GSE/Autorità.</w:t>
+      </w:r>
+    </w:p>
+    <w:p>
+      <w:r>
+        <w:t>8.3.4 Riesami di progettazione</w:t>
+      </w:r>
+    </w:p>
+    <w:p>
+      <w:r>
+        <w:t>Sono previsti riesami formali in fase di progetto definitivo ed esecutivo con verifica conformità agli input, conformità normativa, fattibilità installazione, impatti sicurezza e ambiente. Registrazione esito nel MOD-RIE-01 - Check-list Riesame Progetto.</w:t>
+      </w:r>
+    </w:p>
+    <w:p>
+      <w:r>
+        <w:t>8.3.5 Verifiche e validazioni</w:t>
+      </w:r>
+    </w:p>
+    <w:p>
+      <w:r>
+        <w:t>• Verifiche elettriche: sezioni cavi, protezioni, caduta di tensione, messa a terra, scariche atmosferiche;</w:t>
+      </w:r>
+    </w:p>
+    <w:p>
+      <w:r>
+        <w:t>• Verifica strutturale: carichi permanenti e variabili su coperture;</w:t>
+      </w:r>
+    </w:p>
+    <w:p>
+      <w:r>
+        <w:t>• Validazione produttiva: simulazione annuale con confronto su impianti analoghi;</w:t>
+      </w:r>
+    </w:p>
+    <w:p>
+      <w:r>
+        <w:t>• Validazione GSE: verifica requisiti per accesso incentivi/conto energia.</w:t>
+      </w:r>
+    </w:p>
+    <w:p>
+      <w:r>
+        <w:t>8.3.6 Output di progettazione</w:t>
+      </w:r>
+    </w:p>
+    <w:p>
+      <w:r>
+        <w:t>I deliverable includono: progetto preliminare/definitivo/esecutivo firmato da tecnico abilitato; pratica GSE; documentazione per autorizzazioni; distinta materiali; piano di montaggio e cronoprogramma; piano di sicurezza e coordinamento (PSC) se cantiere qualificato.</w:t>
+      </w:r>
+    </w:p>
+    <w:p>
+      <w:r>
+        <w:t>8.3.7 Gestione delle modifiche progettuali</w:t>
+      </w:r>
+    </w:p>
+    <w:p>
+      <w:r>
+        <w:t>Le modifiche in corso d'opera sono documentate con motivazione, sottoposte a riesame impatto su sicurezza/ambiente/costi/tempi, approvate formalmente, comunicate a tutte le parti interessate.</w:t>
+      </w:r>
+    </w:p>
+    <w:p>
+      <w:r>
+        <w:t>Procedure correlate: PROC-DES-01 - Gestione Progettazione Impianti Fotovoltaici.</w:t>
+      </w:r>
+    </w:p>
+    <w:p>
+      <w:r>
+        <w:t>8.4 Produzione ed erogazione del servizio</w:t>
+      </w:r>
+    </w:p>
+    <w:p>
+      <w:r>
+        <w:t>I processi operativi principali di Tresun S.r.l. sono strutturati per garantire l'integrazione dei requisiti di qualità, ambiente e sicurezza in ogni fase delle attività:</w:t>
+      </w:r>
+    </w:p>
+    <w:tbl>
+      <w:tblPr>
+        <w:tblStyle w:val="Tabellanormale"/>
+        <w:tblW w:type="auto" w:w="0"/>
+        <w:tblLook w:firstColumn="1" w:firstRow="1" w:lastColumn="0" w:lastRow="0" w:noHBand="0" w:noVBand="1" w:val="04A0"/>
+      </w:tblPr>
+      <w:tblGrid>
+        <w:gridCol w:w="4677"/>
+        <w:gridCol w:w="4677"/>
+      </w:tblGrid>
+      <w:tr>
+        <w:tc>
+          <w:tcPr>
+            <w:tcW w:type="dxa" w:w="4677"/>
+          </w:tcPr>
+          <w:p>
+            <w:r>
+              <w:t>Processo</w:t>
+            </w:r>
+          </w:p>
+        </w:tc>
+        <w:tc>
+          <w:tcPr>
+            <w:tcW w:type="dxa" w:w="4677"/>
+          </w:tcPr>
+          <w:p>
+            <w:r>
+              <w:t>Descrizione</w:t>
+            </w:r>
+          </w:p>
+        </w:tc>
+      </w:tr>
+      <w:tr>
+        <w:tc>
+          <w:tcPr>
+            <w:tcW w:type="dxa" w:w="4677"/>
+          </w:tcPr>
+          <w:p>
+            <w:r>
+              <w:t>Installazione impianti fotovoltaici</w:t>
+            </w:r>
+          </w:p>
+        </w:tc>
+        <w:tc>
+          <w:tcPr>
+            <w:tcW w:type="dxa" w:w="4677"/>
+          </w:tcPr>
+          <w:p>
+            <w:r>
+              <w:t>Progettazione, fornitura, installazione e collaudo di impianti fotovoltaici commerciali e industriali</w:t>
+            </w:r>
+          </w:p>
+        </w:tc>
+      </w:tr>
+      <w:tr>
+        <w:tc>
+          <w:tcPr>
+            <w:tcW w:type="dxa" w:w="4677"/>
+          </w:tcPr>
+          <w:p>
+            <w:r>
+              <w:t>Revamping</w:t>
+            </w:r>
+          </w:p>
+        </w:tc>
+        <w:tc>
+          <w:tcPr>
+            <w:tcW w:type="dxa" w:w="4677"/>
+          </w:tcPr>
+          <w:p>
+            <w:r>
+              <w:t>Aggiornamento e potenziamento di impianti esistenti con sostituzione di moduli, inverter e sistemi di ottimizzazione</w:t>
+            </w:r>
+          </w:p>
+        </w:tc>
+      </w:tr>
+      <w:tr>
+        <w:tc>
+          <w:tcPr>
+            <w:tcW w:type="dxa" w:w="4677"/>
+          </w:tcPr>
+          <w:p>
+            <w:r>
+              <w:t>Manutenzione</w:t>
+            </w:r>
+          </w:p>
+        </w:tc>
+        <w:tc>
+          <w:tcPr>
+            <w:tcW w:type="dxa" w:w="4677"/>
+          </w:tcPr>
+          <w:p>
+            <w:r>
+              <w:t>Manutenzione ordinaria e straordinaria, verifiche periodiche, pulizia moduli e controllo delle prestazioni</w:t>
+            </w:r>
+          </w:p>
+        </w:tc>
+      </w:tr>
+      <w:tr>
+        <w:tc>
+          <w:tcPr>
+            <w:tcW w:type="dxa" w:w="4677"/>
+          </w:tcPr>
+          <w:p>
+            <w:r>
+              <w:t>Monitoraggio</w:t>
+            </w:r>
+          </w:p>
+        </w:tc>
+        <w:tc>
+          <w:tcPr>
+            <w:tcW w:type="dxa" w:w="4677"/>
+          </w:tcPr>
+          <w:p>
+            <w:r>
+              <w:t>Diagnostica remota, analisi delle performance, identificazione anomalie e interventi tempestivi</w:t>
+            </w:r>
+          </w:p>
+        </w:tc>
+      </w:tr>
+    </w:tbl>
+    <w:p>
+      <w:r/>
+    </w:p>
+    <w:p>
+      <w:r/>
+    </w:p>
+    <w:p>
+      <w:r>
+        <w:t>8.5 Controllo dei processi esterni forniti</w:t>
+      </w:r>
+    </w:p>
+    <w:p>
+      <w:r>
+        <w:t>La gestione dei fornitori e dei subappaltatori è un elemento critico per garantire la qualità dei servizi e la sicurezza delle operazioni. Tresun S.r.l. applica un processo strutturato che comprende la valutazione preliminare delle capacità tecniche e organizzative dei fornitori, la qualifica formale con verifica dei requisiti obbligatori, il monitoraggio continuo delle prestazioni attraverso indicatori specifici, e la revisione periodica del registro dei fornitori qualificati con eventuali azioni di miglioramento o esclusione.</w:t>
+      </w:r>
+    </w:p>
+    <w:p>
+      <w:r>
+        <w:t>In conformità a quanto previsto dall'art. 26 del D.Lgs. 81/2008 e dal requisito ISO 45001 §8.1.4, il processo di qualifica dei fornitori e subappaltatori include la verifica dell'idoneità tecnico-professionale, la trasmissione delle informazioni sui rischi specifici presenti nei luoghi di lavoro, e il controllo del DURC. Le modalità operative sono definite nella procedura PROC-FOR-01 — Qualifica e Gestione Fornitori.</w:t>
+      </w:r>
+    </w:p>
+    <w:p>
+      <w:r>
+        <w:t>8.6 Rilascio dei prodotti e servizi</w:t>
+      </w:r>
+    </w:p>
+    <w:p>
+      <w:r>
+        <w:t>8.6.1 Generalità</w:t>
+      </w:r>
+    </w:p>
+    <w:p>
+      <w:r>
+        <w:t>Il rilascio degli impianti fotovoltaici avviene solo dopo il completamento delle verifiche pianificate e l'approvazione formale della conformità.</w:t>
+      </w:r>
+    </w:p>
+    <w:p>
+      <w:r>
+        <w:t>8.6.2 Verifiche pre-rilascio</w:t>
+      </w:r>
+    </w:p>
+    <w:p>
+      <w:r>
+        <w:t>Sono eseguite le seguenti verifiche documentate nel MOD-CHK-01 - Check-list Verifica Finale:</w:t>
+      </w:r>
+    </w:p>
+    <w:tbl>
+      <w:tblPr>
+        <w:tblStyle w:val="Tabellanormale"/>
+        <w:tblW w:type="auto" w:w="0"/>
+        <w:tblLook w:firstColumn="1" w:firstRow="1" w:lastColumn="0" w:lastRow="0" w:noHBand="0" w:noVBand="1" w:val="04A0"/>
+      </w:tblPr>
+      <w:tblGrid>
+        <w:gridCol w:w="3118"/>
+        <w:gridCol w:w="3118"/>
+        <w:gridCol w:w="3118"/>
+      </w:tblGrid>
+      <w:tr>
+        <w:tc>
+          <w:tcPr>
+            <w:tcW w:type="dxa" w:w="3118"/>
+          </w:tcPr>
+          <w:p>
+            <w:r>
+              <w:t>Verifica</w:t>
+            </w:r>
+          </w:p>
+        </w:tc>
+        <w:tc>
+          <w:tcPr>
+            <w:tcW w:type="dxa" w:w="3118"/>
+          </w:tcPr>
+          <w:p>
+            <w:r>
+              <w:t>Metodo</w:t>
+            </w:r>
+          </w:p>
+        </w:tc>
+        <w:tc>
+          <w:tcPr>
+            <w:tcW w:type="dxa" w:w="3118"/>
+          </w:tcPr>
+          <w:p>
+            <w:r>
+              <w:t>Criterio accettazione</w:t>
+            </w:r>
+          </w:p>
+        </w:tc>
+      </w:tr>
+      <w:tr>
+        <w:tc>
+          <w:tcPr>
+            <w:tcW w:type="dxa" w:w="3118"/>
+          </w:tcPr>
+          <w:p>
+            <w:r>
+              <w:t>Isolamento impianto DC</w:t>
+            </w:r>
+          </w:p>
+        </w:tc>
+        <w:tc>
+          <w:tcPr>
+            <w:tcW w:type="dxa" w:w="3118"/>
+          </w:tcPr>
+          <w:p>
+            <w:r>
+              <w:t>Megohmmetro</w:t>
+            </w:r>
+          </w:p>
+        </w:tc>
+        <w:tc>
+          <w:tcPr>
+            <w:tcW w:type="dxa" w:w="3118"/>
+          </w:tcPr>
+          <w:p>
+            <w:r>
+              <w:t>&gt; 1 MΩ</w:t>
+            </w:r>
+          </w:p>
+        </w:tc>
+      </w:tr>
+      <w:tr>
+        <w:tc>
+          <w:tcPr>
+            <w:tcW w:type="dxa" w:w="3118"/>
+          </w:tcPr>
+          <w:p>
+            <w:r>
+              <w:t>Continuità conduttori protezione</w:t>
+            </w:r>
+          </w:p>
+        </w:tc>
+        <w:tc>
+          <w:tcPr>
+            <w:tcW w:type="dxa" w:w="3118"/>
+          </w:tcPr>
+          <w:p>
+            <w:r>
+              <w:t>Misuratore</w:t>
+            </w:r>
+          </w:p>
+        </w:tc>
+        <w:tc>
+          <w:tcPr>
+            <w:tcW w:type="dxa" w:w="3118"/>
+          </w:tcPr>
+          <w:p>
+            <w:r>
+              <w:t>&lt; 1 Ω</w:t>
+            </w:r>
+          </w:p>
+        </w:tc>
+      </w:tr>
+      <w:tr>
+        <w:tc>
+          <w:tcPr>
+            <w:tcW w:type="dxa" w:w="3118"/>
+          </w:tcPr>
+          <w:p>
+            <w:r>
+              <w:t>Tensione a vuoto stringhe</w:t>
+            </w:r>
+          </w:p>
+        </w:tc>
+        <w:tc>
+          <w:tcPr>
+            <w:tcW w:type="dxa" w:w="3118"/>
+          </w:tcPr>
+          <w:p>
+            <w:r>
+              <w:t>Multimetro</w:t>
+            </w:r>
+          </w:p>
+        </w:tc>
+        <w:tc>
+          <w:tcPr>
+            <w:tcW w:type="dxa" w:w="3118"/>
+          </w:tcPr>
+          <w:p>
+            <w:r>
+              <w:t>Conforme a specifiche moduli</w:t>
+            </w:r>
+          </w:p>
+        </w:tc>
+      </w:tr>
+      <w:tr>
+        <w:tc>
+          <w:tcPr>
+            <w:tcW w:type="dxa" w:w="3118"/>
+          </w:tcPr>
+          <w:p>
+            <w:r>
+              <w:t>Tensione in funzione inverter</w:t>
+            </w:r>
+          </w:p>
+        </w:tc>
+        <w:tc>
+          <w:tcPr>
+            <w:tcW w:type="dxa" w:w="3118"/>
+          </w:tcPr>
+          <w:p>
+            <w:r>
+              <w:t>Lettura display</w:t>
+            </w:r>
+          </w:p>
+        </w:tc>
+        <w:tc>
+          <w:tcPr>
+            <w:tcW w:type="dxa" w:w="3118"/>
+          </w:tcPr>
+          <w:p>
+            <w:r>
+              <w:t>Entro range operativo</w:t>
+            </w:r>
+          </w:p>
+        </w:tc>
+      </w:tr>
+      <w:tr>
+        <w:tc>
+          <w:tcPr>
+            <w:tcW w:type="dxa" w:w="3118"/>
+          </w:tcPr>
+          <w:p>
+            <w:r>
+              <w:t>Allineamento moduli</w:t>
+            </w:r>
+          </w:p>
+        </w:tc>
+        <w:tc>
+          <w:tcPr>
+            <w:tcW w:type="dxa" w:w="3118"/>
+          </w:tcPr>
+          <w:p>
+            <w:r>
+              <w:t>Controllo visivo</w:t>
+            </w:r>
+          </w:p>
+        </w:tc>
+        <w:tc>
+          <w:tcPr>
+            <w:tcW w:type="dxa" w:w="3118"/>
+          </w:tcPr>
+          <w:p>
+            <w:r>
+              <w:t>± 5° rispetto a progetto</w:t>
+            </w:r>
+          </w:p>
+        </w:tc>
+      </w:tr>
+      <w:tr>
+        <w:tc>
+          <w:tcPr>
+            <w:tcW w:type="dxa" w:w="3118"/>
+          </w:tcPr>
+          <w:p>
+            <w:r>
+              <w:t>Fissaggi meccanici</w:t>
+            </w:r>
+          </w:p>
+        </w:tc>
+        <w:tc>
+          <w:tcPr>
+            <w:tcW w:type="dxa" w:w="3118"/>
+          </w:tcPr>
+          <w:p>
+            <w:r>
+              <w:t>Controllo visivo + coppia</w:t>
+            </w:r>
+          </w:p>
+        </w:tc>
+        <w:tc>
+          <w:tcPr>
+            <w:tcW w:type="dxa" w:w="3118"/>
+          </w:tcPr>
+          <w:p>
+            <w:r>
+              <w:t>Conforme a specifiche produttore</w:t>
+            </w:r>
+          </w:p>
+        </w:tc>
+      </w:tr>
+      <w:tr>
+        <w:tc>
+          <w:tcPr>
+            <w:tcW w:type="dxa" w:w="3118"/>
+          </w:tcPr>
+          <w:p>
+            <w:r>
+              <w:t>Segnaletica sicurezza</w:t>
+            </w:r>
+          </w:p>
+        </w:tc>
+        <w:tc>
+          <w:tcPr>
+            <w:tcW w:type="dxa" w:w="3118"/>
+          </w:tcPr>
+          <w:p>
+            <w:r>
+              <w:t>Controllo visivo</w:t>
+            </w:r>
+          </w:p>
+        </w:tc>
+        <w:tc>
+          <w:tcPr>
+            <w:tcW w:type="dxa" w:w="3118"/>
+          </w:tcPr>
+          <w:p>
+            <w:r>
+              <w:t>Presenza cartelli, schema unifilare, istruzioni emergenza</w:t>
+            </w:r>
+          </w:p>
+        </w:tc>
+      </w:tr>
+    </w:tbl>
+    <w:p>
+      <w:r>
+        <w:t>8.6.3 Collaudo funzionale</w:t>
+      </w:r>
+    </w:p>
+    <w:p>
+      <w:r>
+        <w:t>Il collaudo con il cliente include: verifica funzionamento impianto in condizioni reali; spiegazione funzionamento inverter e monitoraggio; consegna documentazione (manuale utente, certificati conformità componenti, progetto as-built); sottoscrizione MOD-COL-01 - Verbale di Collaudo e Consegna.</w:t>
+      </w:r>
+    </w:p>
+    <w:p>
+      <w:r>
+        <w:t>8.6.4 Autorizzazione al rilascio</w:t>
+      </w:r>
+    </w:p>
+    <w:p>
+      <w:r>
+        <w:t>Il rilascio è autorizzato da Responsabile Tecnico (verifica conformità progetto e normativa) e Responsabile SGI (verifica completezza documentazione SGI). Nessun impianto è rilasciato in assenza di collaudo tecnico positivo, documentazione completa, pratica GSE presentata (se di competenza Tresun).</w:t>
+      </w:r>
+    </w:p>
+    <w:p>
+      <w:r>
+        <w:t>8.6.5 Tracciabilità del rilascio</w:t>
+      </w:r>
+    </w:p>
+    <w:p>
+      <w:r>
+        <w:t>Ogni rilascio è registrato con: data collaudo; nominativo tecnici intervenuti; esito verifiche; eventuali non conformità risolte; firma cliente accettazione.</w:t>
+      </w:r>
+    </w:p>
+    <w:p>
+      <w:r/>
+    </w:p>
+    <w:p>
+      <w:r>
+        <w:t>8.7 Controllo degli output non conformi</w:t>
+      </w:r>
+    </w:p>
+    <w:p>
+      <w:r>
+        <w:t>8.7.1 Generalità</w:t>
+      </w:r>
+    </w:p>
+    <w:p>
+      <w:r>
+        <w:t>Tresun S.r.l. controlla gli output non conformi (moduli difettosi, scarti installazione, lavorazioni difformi) per prevenirne uso involontario o consegna al cliente.</w:t>
+      </w:r>
+    </w:p>
+    <w:p>
+      <w:r>
+        <w:t>8.7.2 Identificazione e segregazione</w:t>
+      </w:r>
+    </w:p>
+    <w:p>
+      <w:r>
+        <w:t>I materiali o lavorazioni non conformi sono: identificati con etichetta "NON CONFORME" con indicazione motivo; segregati in area dedicata del cantiere o magazzino; registrati nel REG-ONC-01 - Registro Output Non Conformi.</w:t>
+      </w:r>
+    </w:p>
+    <w:p>
+      <w:r>
+        <w:t>Categorie tipiche di NC: moduli vetri rotti o celle danneggiate; inverter difettosi o non conformi alle specifiche; scarti materiali installazione (cavi, canaline, fissaggi); lavorazioni difformi (allineamento errato, cablaggi non conformi).</w:t>
+      </w:r>
+    </w:p>
+    <w:p>
+      <w:r>
+        <w:t>8.7.3 Valutazione disposizione</w:t>
+      </w:r>
+    </w:p>
+    <w:p>
+      <w:r>
+        <w:t>Per ogni NC è valutata la disposizione:</w:t>
+      </w:r>
+    </w:p>
+    <w:tbl>
+      <w:tblPr>
+        <w:tblStyle w:val="Tabellanormale"/>
+        <w:tblW w:type="auto" w:w="0"/>
+        <w:tblLook w:firstColumn="1" w:firstRow="1" w:lastColumn="0" w:lastRow="0" w:noHBand="0" w:noVBand="1" w:val="04A0"/>
+      </w:tblPr>
+      <w:tblGrid>
+        <w:gridCol w:w="3118"/>
+        <w:gridCol w:w="3118"/>
+        <w:gridCol w:w="3118"/>
+      </w:tblGrid>
+      <w:tr>
+        <w:tc>
+          <w:tcPr>
+            <w:tcW w:type="dxa" w:w="3118"/>
+          </w:tcPr>
+          <w:p>
+            <w:r>
+              <w:t>Disposizione</w:t>
+            </w:r>
+          </w:p>
+        </w:tc>
+        <w:tc>
+          <w:tcPr>
+            <w:tcW w:type="dxa" w:w="3118"/>
+          </w:tcPr>
+          <w:p>
+            <w:r>
+              <w:t>Casistica</w:t>
+            </w:r>
+          </w:p>
+        </w:tc>
+        <w:tc>
+          <w:tcPr>
+            <w:tcW w:type="dxa" w:w="3118"/>
+          </w:tcPr>
+          <w:p>
+            <w:r>
+              <w:t>Autorizzazione</w:t>
+            </w:r>
+          </w:p>
+        </w:tc>
+      </w:tr>
+      <w:tr>
+        <w:tc>
+          <w:tcPr>
+            <w:tcW w:type="dxa" w:w="3118"/>
+          </w:tcPr>
+          <w:p>
+            <w:r>
+              <w:t>Rework/Riparazione</w:t>
+            </w:r>
+          </w:p>
+        </w:tc>
+        <w:tc>
+          <w:tcPr>
+            <w:tcW w:type="dxa" w:w="3118"/>
+          </w:tcPr>
+          <w:p>
+            <w:r>
+              <w:t>Moduli con difetti estetici minori, errori cablaggio correggibili</w:t>
+            </w:r>
+          </w:p>
+        </w:tc>
+        <w:tc>
+          <w:tcPr>
+            <w:tcW w:type="dxa" w:w="3118"/>
+          </w:tcPr>
+          <w:p>
+            <w:r>
+              <w:t>Responsabile Tecnico</w:t>
+            </w:r>
+          </w:p>
+        </w:tc>
+      </w:tr>
+      <w:tr>
+        <w:tc>
+          <w:tcPr>
+            <w:tcW w:type="dxa" w:w="3118"/>
+          </w:tcPr>
+          <w:p>
+            <w:r>
+              <w:t>Accettazione con deroga</w:t>
+            </w:r>
+          </w:p>
+        </w:tc>
+        <w:tc>
+          <w:tcPr>
+            <w:tcW w:type="dxa" w:w="3118"/>
+          </w:tcPr>
+          <w:p>
+            <w:r>
+              <w:t>Difformità tecniche non impattanti performance, accettate dal cliente</w:t>
+            </w:r>
+          </w:p>
+        </w:tc>
+        <w:tc>
+          <w:tcPr>
+            <w:tcW w:type="dxa" w:w="3118"/>
+          </w:tcPr>
+          <w:p>
+            <w:r>
+              <w:t>Cliente (firma deroga) + Direzione</w:t>
+            </w:r>
+          </w:p>
+        </w:tc>
+      </w:tr>
+      <w:tr>
+        <w:tc>
+          <w:tcPr>
+            <w:tcW w:type="dxa" w:w="3118"/>
+          </w:tcPr>
+          <w:p>
+            <w:r>
+              <w:t>Scarto/Rifiuto</w:t>
+            </w:r>
+          </w:p>
+        </w:tc>
+        <w:tc>
+          <w:tcPr>
+            <w:tcW w:type="dxa" w:w="3118"/>
+          </w:tcPr>
+          <w:p>
+            <w:r>
+              <w:t>Moduli rotti, componenti non riparabili, materiali fuori specifica</w:t>
+            </w:r>
+          </w:p>
+        </w:tc>
+        <w:tc>
+          <w:tcPr>
+            <w:tcW w:type="dxa" w:w="3118"/>
+          </w:tcPr>
+          <w:p>
+            <w:r>
+              <w:t>Direzione</w:t>
+            </w:r>
+          </w:p>
+        </w:tc>
+      </w:tr>
+    </w:tbl>
+    <w:p>
+      <w:r>
+        <w:t>8.7.4 Gestione scarti e rifiuti</w:t>
+      </w:r>
+    </w:p>
+    <w:p>
+      <w:r>
+        <w:t>• RAEE: moduli, inverter, batterie dismesse gestite come rifiuti pericolosi (codici 20.01.36, 20.01.21) con registro di carico/scarico;</w:t>
+      </w:r>
+    </w:p>
+    <w:p>
+      <w:r>
+        <w:t>• rifiuti non pericolosi: imballaggi, scarti metallici, cavi;</w:t>
+      </w:r>
+    </w:p>
+    <w:p>
+      <w:r>
+        <w:t>• smaltimento: solo tramite gestori autorizzati (registrati nel REG-RAEE-01).</w:t>
+      </w:r>
+    </w:p>
+    <w:p>
+      <w:r>
+        <w:t>8.7.5 Informazione al cliente</w:t>
+      </w:r>
+    </w:p>
+    <w:p>
+      <w:r>
+        <w:t>Il cliente è informato tempestivamente quando: la NC impatta le prestazioni dell'impianto; sono necessarie deroghe tecniche; i tempi di consegna subiscono variazioni.</w:t>
+      </w:r>
+    </w:p>
+    <w:p>
+      <w:r>
+        <w:t>Procedure correlate: PROC-ONC-01 - Gestione Output Non Conformi.</w:t>
+      </w:r>
+    </w:p>
+    <w:p>
+      <w:r>
+        <w:t>8.8 Gestione delle emergenze operative</w:t>
+      </w:r>
+    </w:p>
+    <w:p>
+      <w:r>
+        <w:t>L'organizzazione ha definito procedure specifiche per la gestione delle emergenze, con particolare riferimento agli scenari tipici delle attività svolte. Le procedure di emergenza coprono gli incendi in cantiere e presso le sedi operative, gli eventi meteorologici avversi con particolare attenzione a temporali e venti forti, il rischio elettrico con procedure di primo soccorso specifiche per elettrocuzione, e le cadute dall'alto con protocolli di emergenza e primo soccorso. Il personale è formato sulle procedure di emergenza e vengono effettuate esercitazioni periodiche per verificare l'efficacia delle stesse.</w:t>
+      </w:r>
+    </w:p>
+    <w:p>
+      <w:r>
+        <w:t>Le situazioni di emergenza potenziale sono identificate nell'ambito dell'analisi degli aspetti ambientali significativi (RAA-SGI-01) e della valutazione dei rischi per la sicurezza, con riferimento sia alle condizioni operative normali che a quelle anomale e di emergenza, come richiesto da ISO 14001 §6.1.1 e ISO 45001 §8.2. Le procedure di risposta alle emergenze sono definite nella PROC-EME-01 Preparazione e Risposta alle Emergenze, oggetto di esercitazioni periodiche con registrazione degli esiti.</w:t>
+      </w:r>
+    </w:p>
+    <w:p>
+      <w:r>
+        <w:t>9. Valutazione delle prestazioni</w:t>
+      </w:r>
+    </w:p>
+    <w:p>
+      <w:r>
+        <w:t>9.1 Monitoraggio e misurazioni</w:t>
+      </w:r>
+    </w:p>
+    <w:p>
+      <w:r>
+        <w:t>Il Sistema di Gestione Integrato prevede un sistema strutturato di indicatori per il monitoraggio delle prestazioni nelle tre aree di competenza. Gli indicatori sono definiti, misurati e analizzati periodicamente per valutare il raggiungimento degli obiettivi e identificare opportunità di miglioramento. Gli indicatori coprono la qualità con metriche su non conformità, soddisfazione clienti e tempi di intervento, l'ambiente con misurazioni su produzione rifiuti, consumo di risorse e gestione RAEE, e la sicurezza con statistiche su infortuni, near miss e formazione.</w:t>
+      </w:r>
+    </w:p>
+    <w:p>
+      <w:r>
+        <w:t>9.1.2 Valutazione della conformità</w:t>
+      </w:r>
+    </w:p>
+    <w:p>
+      <w:r>
+        <w:t>9.1.2.1 Conformità ambientale</w:t>
+      </w:r>
+    </w:p>
+    <w:p>
+      <w:r>
+        <w:t>Tresun valuta sistematicamente la conformità agli obblighi di compliance ambientali attraverso:</w:t>
+      </w:r>
+    </w:p>
+    <w:p>
+      <w:r>
+        <w:t>• frequenza: semestrale per requisiti critici (autorizzazioni, RAEE, gestione rifiuti); annuale per altri requisiti;</w:t>
+      </w:r>
+    </w:p>
+    <w:p>
+      <w:r>
+        <w:t>• metodi: verifica documentale, ispezioni interne, analisi di laboratorio se richiesto;</w:t>
+      </w:r>
+    </w:p>
+    <w:p>
+      <w:r>
+        <w:t>• responsabile: Responsabile SGI;</w:t>
+      </w:r>
+    </w:p>
+    <w:p>
+      <w:r>
+        <w:t>• registrazione: REG-CONF-AMB-01 - Registro Valutazione Conformità Ambientale.</w:t>
+      </w:r>
+    </w:p>
+    <w:p>
+      <w:r>
+        <w:t>9.1.2.2 Conformità sicurezza sul lavoro</w:t>
+      </w:r>
+    </w:p>
+    <w:p>
+      <w:r>
+        <w:t>La valutazione della conformità al D.Lgs. 81/08 include: verifica periodica DVR e misure di controllo; verifica PSC/POS cantieri; controllo idoneità medica e formazione; ispezione DPI e attrezzature; registrazione nel REG-CONF-SIC-01 - Registro Valutazione Conformità Sicurezza.</w:t>
+      </w:r>
+    </w:p>
+    <w:p>
+      <w:r>
+        <w:t>I risultati delle valutazioni di conformità sono input obbligatori del Riesame della Direzione (§9.3).</w:t>
+      </w:r>
+    </w:p>
+    <w:p>
+      <w:r>
+        <w:t>9.2 Audit interni</w:t>
+      </w:r>
+    </w:p>
+    <w:p>
+      <w:r>
+        <w:t>Il programma annuale di audit interni è strutturato in modo integrato per verificare la conformità e l'efficacia del Sistema di Gestione Integrato rispetto ai requisiti delle tre norme di riferimento. Gli audit sono pianificati tenendo conto dello stato e dell'importanza dei processi, dei risultati degli audit precedenti e delle eventuali modifiche organizzative. I risultati degli audit sono documentati, comunicati alle funzioni interessate e oggetto di azioni correttive quando necessario.</w:t>
+      </w:r>
+    </w:p>
+    <w:p>
+      <w:r>
+        <w:t>Gli audit interni sono pianificati e condotti secondo la procedura ‘PROC-AUD-01 – Audit Interni SGI’.</w:t>
+      </w:r>
+    </w:p>
+    <w:p>
+      <w:r>
+        <w:t>Il Programma Annuale degli Audit definisce:</w:t>
+      </w:r>
+    </w:p>
+    <w:p>
+      <w:r>
+        <w:t>• processi da auditare;</w:t>
+      </w:r>
+    </w:p>
+    <w:p>
+      <w:r>
+        <w:t>• criteri e metodi;</w:t>
+      </w:r>
+    </w:p>
+    <w:p>
+      <w:r>
+        <w:t>• competenze degli auditor;</w:t>
+      </w:r>
+    </w:p>
+    <w:p>
+      <w:r>
+        <w:t>• frequenza;</w:t>
+      </w:r>
+    </w:p>
+    <w:p>
+      <w:r>
+        <w:t>• responsabilità;</w:t>
+      </w:r>
+    </w:p>
+    <w:p>
+      <w:r>
+        <w:t>• modalità di reporting.</w:t>
+      </w:r>
+    </w:p>
+    <w:p>
+      <w:r>
+        <w:t>9.3 Riesame della Direzione</w:t>
+      </w:r>
+    </w:p>
+    <w:p>
+      <w:r>
+        <w:t>Il Riesame della Direzione costituisce il momento fondamentale per la valutazione delle performance complessive del Sistema di Gestione Integrato e per la definizione delle azioni strategiche di miglioramento. Il Riesame è condotto con cadenza annuale e prevede l'analisi dei risultati degli indicatori, l'esame dei risultati degli audit interni ed esterni, la valutazione delle non conformità e delle azioni correttive, l'analisi delle segnalazioni e dei reclami, e la definizione degli obiettivi e delle risorse per il periodo successivo.</w:t>
+      </w:r>
+    </w:p>
+    <w:p>
+      <w:r>
+        <w:t>Il Riesame della Direzione è documentato mediante il Verbale VRD-SGI-01, che include tutti gli input previsti dalle norme ISO 9001, ISO 14001 e ISO 45001:</w:t>
+      </w:r>
+    </w:p>
+    <w:p>
+      <w:r>
+        <w:t>• stato delle azioni da precedenti riesami;</w:t>
+      </w:r>
+    </w:p>
+    <w:p>
+      <w:r>
+        <w:t>• risultati audit;</w:t>
+      </w:r>
+    </w:p>
+    <w:p>
+      <w:r>
+        <w:t>• prestazioni dei processi e conformità dei prodotti/servizi;</w:t>
+      </w:r>
+    </w:p>
+    <w:p>
+      <w:r>
+        <w:t>• indicatori e obiettivi;</w:t>
+      </w:r>
+    </w:p>
+    <w:p>
+      <w:r>
+        <w:t>• stato della conformità legale;</w:t>
+      </w:r>
+    </w:p>
+    <w:p>
+      <w:r>
+        <w:t>• comunicazioni delle parti interessate;</w:t>
+      </w:r>
+    </w:p>
+    <w:p>
+      <w:r>
+        <w:t>• rischi e opportunità;</w:t>
+      </w:r>
+    </w:p>
+    <w:p>
+      <w:r>
+        <w:t>• necessità di risorse;</w:t>
+      </w:r>
+    </w:p>
+    <w:p>
+      <w:r>
+        <w:t>• opportunità di miglioramento.</w:t>
+      </w:r>
+    </w:p>
+    <w:p>
+      <w:r>
+        <w:t>10. Miglioramento</w:t>
+      </w:r>
+    </w:p>
+    <w:p>
+      <w:r>
+        <w:t>10.2 Non conformità e azioni correttive</w:t>
+      </w:r>
+    </w:p>
+    <w:p>
+      <w:r>
+        <w:t>La gestione delle non conformità è centralizzata attraverso un modulo unico che consente di registrare, analizzare e trattare le non conformità relative a qualità, ambiente e sicurezza. Il processo prevede l'identificazione e la registrazione della non conformità, l'analisi delle cause attraverso metodologie strutturate, la definizione e implementazione delle azioni correttive, la verifica dell'efficacia delle azioni intraprese, e l'aggiornamento della documentazione quando necessario.</w:t>
+      </w:r>
+    </w:p>
+    <w:p>
+      <w:r>
+        <w:t>Il processo distingue tra correzione immediata (trattamento della NC per eliminare la non conformità rilevata) e azione correttiva strutturata (analisi delle cause e intervento sul sistema per prevenire la ripetizione). Entrambe le fasi sono registrate nel REG-NC-01. In situazioni di emergenza o rischio immediato per la sicurezza o l'ambiente, la correzione è prioritaria rispetto all'analisi delle cause, che viene comunque completata entro i termini definiti dalla procedura PROC-NC-01</w:t>
+      </w:r>
+    </w:p>
+    <w:p>
+      <w:r>
+        <w:t>La gestione delle non conformità e delle azioni correttive è regolata dalla procedura ‘PROC-NC-01 – Gestione Non Conformità e Azioni Correttive’.</w:t>
+      </w:r>
+    </w:p>
+    <w:p>
+      <w:r>
+        <w:t>Tutte le NC sono registrate nel Registro NC/AC (REG-NC-01), che include:</w:t>
+      </w:r>
+    </w:p>
+    <w:p>
+      <w:r>
+        <w:t>• descrizione;</w:t>
+      </w:r>
+    </w:p>
+    <w:p>
+      <w:r>
+        <w:t>• cause;</w:t>
+      </w:r>
+    </w:p>
+    <w:p>
+      <w:r>
+        <w:t>• azioni correttive;</w:t>
+      </w:r>
+    </w:p>
+    <w:p>
+      <w:r>
+        <w:t>• responsabili;</w:t>
+      </w:r>
+    </w:p>
+    <w:p>
+      <w:r>
+        <w:t>• tempistiche;</w:t>
+      </w:r>
+    </w:p>
+    <w:p>
+      <w:r>
+        <w:t>• verifica dell’efficacia.</w:t>
+      </w:r>
+    </w:p>
+    <w:p>
+      <w:r>
+        <w:t>10.3 Incidenti, infortuni e near miss</w:t>
+      </w:r>
+    </w:p>
+    <w:p>
+      <w:r>
+        <w:t>10.3.1 Generalità</w:t>
+      </w:r>
+    </w:p>
+    <w:p>
+      <w:r>
+        <w:t>Tresun S.r.l. ha definito procedure per la segnalazione, registrazione, indagine e gestione di infortuni, malattie professionali, incidenti e near miss (quasi-infortuni), in conformità all'art. 18 D.Lgs. 81/08 e ISO 45001:2018.</w:t>
+      </w:r>
+    </w:p>
+    <w:p>
+      <w:r>
+        <w:t>10.3.2 Definizioni</w:t>
+      </w:r>
+    </w:p>
+    <w:p>
+      <w:r>
+        <w:t>• Infortunio: lesione fisica o disturbo della salute legato all'attività lavorativa;</w:t>
+      </w:r>
+    </w:p>
+    <w:p>
+      <w:r>
+        <w:t>• Incidente: evento non pianificato che ha causato infortunio, malattia, danno a cose o ambiente;</w:t>
+      </w:r>
+    </w:p>
+    <w:p>
+      <w:r>
+        <w:t>• Near miss: evento non pianificato che avrebbe potuto causare infortunio/incidente ma non ha avuto conseguenze per caso o intervento tempestivo.</w:t>
+      </w:r>
+    </w:p>
+    <w:p>
+      <w:r>
+        <w:t>10.3.3 Segnalazione e registrazione</w:t>
+      </w:r>
+    </w:p>
+    <w:p>
+      <w:r>
+        <w:t>• segnalazione immediata al preposto/RSPP in caso di infortunio con conseguenze;</w:t>
+      </w:r>
+    </w:p>
+    <w:p>
+      <w:r>
+        <w:t>• registrazione nel REG-INC-01 - Registro Infortuni e Near Miss entro 24 ore;</w:t>
+      </w:r>
+    </w:p>
+    <w:p>
+      <w:r>
+        <w:t>• documentazione: verbale di infortunio, testimonianze, foto, stato luoghi.</w:t>
+      </w:r>
+    </w:p>
+    <w:p>
+      <w:r>
+        <w:t>10.3.4 Indagine e analisi cause</w:t>
+      </w:r>
+    </w:p>
+    <w:p>
+      <w:r>
+        <w:t>Per ogni incidente/infortunio con prognosi superiore a 3 giorni o potenzialità grave, è condotta indagine con: metodo 5 Perché o analisi albero delle cause; identificazione cause immediate e cause radice; coinvolgimento RLS e lavoratori interessati; documentazione esito indagine nel REG-INC-01.</w:t>
+      </w:r>
+    </w:p>
+    <w:p>
+      <w:r>
+        <w:t>10.3.5 Azioni correttive</w:t>
+      </w:r>
+    </w:p>
+    <w:p>
+      <w:r>
+        <w:t>Sulla base dell'indagine sono definite: azioni immediate per eliminare il pericolo; azioni correttive strutturali per prevenire recidiva; responsabili e tempistiche; verifica efficacia tramite monitoraggio indicatori (riduzione near miss).</w:t>
+      </w:r>
+    </w:p>
+    <w:p>
+      <w:r>
+        <w:t>10.3.6 Retrodata e analisi trend</w:t>
+      </w:r>
+    </w:p>
+    <w:p>
+      <w:r>
+        <w:t>• analisi trimestrale degli incidenti e near miss;</w:t>
+      </w:r>
+    </w:p>
+    <w:p>
+      <w:r>
+        <w:t>• identificazione pattern ricorrenti (tipologia, luogo, attività);</w:t>
+      </w:r>
+    </w:p>
+    <w:p>
+      <w:r>
+        <w:t>• confronto con dati settore (tasso infortunistico, indici INAIL);</w:t>
+      </w:r>
+    </w:p>
+    <w:p>
+      <w:r>
+        <w:t>• proposte di miglioramento al Riesame Direzione.</w:t>
+      </w:r>
+    </w:p>
+    <w:p>
+      <w:r>
+        <w:t>10.3.7 Riservatezza e tutela</w:t>
+      </w:r>
+    </w:p>
+    <w:p>
+      <w:r>
+        <w:t>La segnalazione di near miss è gestita in forma anonima se richiesto dal segnalante, senza possibilità di sanzioni disciplinari per la segnalazione stessa (incentivazione cultura reporting).</w:t>
+      </w:r>
+    </w:p>
+    <w:p>
+      <w:r>
+        <w:t>Procedure correlate: PROC-INC-01 - Gestione Incidenti e Near Miss.</w:t>
+      </w:r>
+    </w:p>
+    <w:p>
+      <w:r>
+        <w:t>10.4 Miglioramento continuo</w:t>
+      </w:r>
+    </w:p>
+    <w:p>
+      <w:r>
+        <w:t>Il miglioramento continuo è un principio fondamentale del Sistema di Gestione Integrato e si realizza attraverso molteplici fonti di input. I risultati degli audit interni ed esterni forniscono indicazioni sulle aree di intervento, mentre l'analisi dei dati e degli indicatori evidenzia trend e criticità. Le segnalazioni del personale e dei clienti rappresentano una fonte preziosa di feedback, e le innovazioni tecnologiche offrono opportunità di miglioramento dell'efficienza e della qualità dei servizi. L'organizzazione promuove attivamente la cultura del miglioramento continuo, incoraggiando la partecipazione di tutto il personale attraverso canali di comunicazione dedicati e sistemi di riconoscimento per le proposte di miglioramento.</w:t>
+      </w:r>
+    </w:p>
+    <w:p>
+      <w:r>
+        <w:t>Allegati</w:t>
+      </w:r>
+    </w:p>
+    <w:p>
+      <w:r>
+        <w:t>Il presente Manuale è completato dai seguenti documenti allegati che ne costituiscono parte integrante:</w:t>
+      </w:r>
+    </w:p>
+    <w:tbl>
+      <w:tblPr>
+        <w:tblStyle w:val="Tabellanormale"/>
+        <w:tblW w:type="auto" w:w="0"/>
+        <w:tblLook w:firstColumn="1" w:firstRow="1" w:lastColumn="0" w:lastRow="0" w:noHBand="0" w:noVBand="1" w:val="04A0"/>
+      </w:tblPr>
+      <w:tblGrid>
+        <w:gridCol w:w="3118"/>
+        <w:gridCol w:w="3118"/>
+        <w:gridCol w:w="3118"/>
+      </w:tblGrid>
+      <w:tr>
+        <w:tc>
+          <w:tcPr>
+            <w:tcW w:type="dxa" w:w="3118"/>
+          </w:tcPr>
+          <w:p>
+            <w:r>
+              <w:t>Codice</w:t>
+            </w:r>
+          </w:p>
+        </w:tc>
+        <w:tc>
+          <w:tcPr>
+            <w:tcW w:type="dxa" w:w="3118"/>
+          </w:tcPr>
+          <w:p>
+            <w:r>
+              <w:t>Documento</w:t>
+            </w:r>
+          </w:p>
+        </w:tc>
+        <w:tc>
+          <w:tcPr>
+            <w:tcW w:type="dxa" w:w="3118"/>
+          </w:tcPr>
+          <w:p>
+            <w:r>
+              <w:t>Riferimento</w:t>
+            </w:r>
+          </w:p>
+        </w:tc>
+      </w:tr>
+      <w:tr>
+        <w:tc>
+          <w:tcPr>
+            <w:tcW w:type="dxa" w:w="3118"/>
+          </w:tcPr>
+          <w:p>
+            <w:r>
+              <w:t>ALL-01</w:t>
+            </w:r>
+          </w:p>
+        </w:tc>
+        <w:tc>
+          <w:tcPr>
+            <w:tcW w:type="dxa" w:w="3118"/>
+          </w:tcPr>
+          <w:p>
+            <w:r>
+              <w:t>Politica Integrata</w:t>
+            </w:r>
+          </w:p>
+        </w:tc>
+        <w:tc>
+          <w:tcPr>
+            <w:tcW w:type="dxa" w:w="3118"/>
+          </w:tcPr>
+          <w:p>
+            <w:r>
+              <w:t>Sezione 5.2</w:t>
+            </w:r>
+          </w:p>
+        </w:tc>
+      </w:tr>
+      <w:tr>
+        <w:tc>
+          <w:tcPr>
+            <w:tcW w:type="dxa" w:w="3118"/>
+          </w:tcPr>
+          <w:p>
+            <w:r>
+              <w:t>ALL-02</w:t>
+            </w:r>
+          </w:p>
+        </w:tc>
+        <w:tc>
+          <w:tcPr>
+            <w:tcW w:type="dxa" w:w="3118"/>
+          </w:tcPr>
+          <w:p>
+            <w:r>
+              <w:t>Matrice rischi integrata</w:t>
+            </w:r>
+          </w:p>
+        </w:tc>
+        <w:tc>
+          <w:tcPr>
+            <w:tcW w:type="dxa" w:w="3118"/>
+          </w:tcPr>
+          <w:p>
+            <w:r>
+              <w:t>Sezione 6.1</w:t>
+            </w:r>
+          </w:p>
+        </w:tc>
+      </w:tr>
+      <w:tr>
+        <w:tc>
+          <w:tcPr>
+            <w:tcW w:type="dxa" w:w="3118"/>
+          </w:tcPr>
+          <w:p>
+            <w:r>
+              <w:t>ALL-03</w:t>
+            </w:r>
+          </w:p>
+        </w:tc>
+        <w:tc>
+          <w:tcPr>
+            <w:tcW w:type="dxa" w:w="3118"/>
+          </w:tcPr>
+          <w:p>
+            <w:r>
+              <w:t>Procedure operative</w:t>
+            </w:r>
+          </w:p>
+        </w:tc>
+        <w:tc>
+          <w:tcPr>
+            <w:tcW w:type="dxa" w:w="3118"/>
+          </w:tcPr>
+          <w:p>
+            <w:r>
+              <w:t>Sezione 7.4</w:t>
+            </w:r>
+          </w:p>
+        </w:tc>
+      </w:tr>
+      <w:tr>
+        <w:tc>
+          <w:tcPr>
+            <w:tcW w:type="dxa" w:w="3118"/>
+          </w:tcPr>
+          <w:p>
+            <w:r>
+              <w:t>ALL-04</w:t>
+            </w:r>
+          </w:p>
+        </w:tc>
+        <w:tc>
+          <w:tcPr>
+            <w:tcW w:type="dxa" w:w="3118"/>
+          </w:tcPr>
+          <w:p>
+            <w:r>
+              <w:t>Modulistica SGI</w:t>
+            </w:r>
+          </w:p>
+        </w:tc>
+        <w:tc>
+          <w:tcPr>
+            <w:tcW w:type="dxa" w:w="3118"/>
+          </w:tcPr>
+          <w:p>
+            <w:r>
+              <w:t>Sezione 7.4</w:t>
+            </w:r>
+          </w:p>
+        </w:tc>
+      </w:tr>
+    </w:tbl>
+    <w:p>
+      <w:r/>
     </w:p>
     <w:sectPr>
       <w:headerReference w:type="default" r:id="rId7"/>

</xml_diff>